<commit_message>
Update version history for installer
</commit_message>
<xml_diff>
--- a/docs/whatsnew.docx
+++ b/docs/whatsnew.docx
@@ -65,7 +65,6 @@
         </w:rPr>
         <w:t xml:space="preserve"> where </w:t>
       </w:r>
-      <w:proofErr w:type="spellStart"/>
       <w:r>
         <w:rPr>
           <w:rStyle w:val="HMNotesBox"/>
@@ -73,7 +72,6 @@
         </w:rPr>
         <w:t>nnn</w:t>
       </w:r>
-      <w:proofErr w:type="spellEnd"/>
       <w:r>
         <w:rPr>
           <w:rStyle w:val="HMNotesBox"/>
@@ -251,69 +249,29 @@
         </w:numPr>
       </w:pPr>
       <w:r>
-        <w:t xml:space="preserve">Added the </w:t>
-      </w:r>
-      <w:proofErr w:type="spellStart"/>
-      <w:r>
-        <w:t>XBaseNet</w:t>
-      </w:r>
-      <w:proofErr w:type="spellEnd"/>
-      <w:r>
-        <w:t xml:space="preserve"> dialect and the /fox3 compiler option for FoxPro-compatible dot syntax; /fox3 is also available as a pragma option and defines the __FOX3__ preprocessor symbol</w:t>
-      </w:r>
-    </w:p>
-    <w:p>
-      <w:pPr>
-        <w:numPr>
-          <w:ilvl w:val="0"/>
-          <w:numId w:val="2"/>
-        </w:numPr>
-      </w:pPr>
-      <w:r>
-        <w:t xml:space="preserve">Added support for FoxPro-style </w:t>
-      </w:r>
-      <w:proofErr w:type="spellStart"/>
-      <w:r>
-        <w:t>Cursor.Field</w:t>
-      </w:r>
-      <w:proofErr w:type="spellEnd"/>
-      <w:r>
-        <w:t xml:space="preserve"> expressions inside </w:t>
-      </w:r>
-      <w:proofErr w:type="spellStart"/>
-      <w:r>
-        <w:t>codeblocks</w:t>
-      </w:r>
-      <w:proofErr w:type="spellEnd"/>
-      <w:r>
-        <w:t xml:space="preserve"> when /fox3 is enabled, including better tracking of </w:t>
-      </w:r>
-      <w:proofErr w:type="spellStart"/>
-      <w:r>
-        <w:t>codeblock</w:t>
-      </w:r>
-      <w:proofErr w:type="spellEnd"/>
-      <w:r>
-        <w:t xml:space="preserve"> parameters during late binding</w:t>
-      </w:r>
-    </w:p>
-    <w:p>
-      <w:pPr>
-        <w:numPr>
-          <w:ilvl w:val="0"/>
-          <w:numId w:val="2"/>
-        </w:numPr>
-      </w:pPr>
-      <w:r>
-        <w:t xml:space="preserve">Improved compiler handling of file-wide </w:t>
-      </w:r>
-      <w:proofErr w:type="spellStart"/>
-      <w:r>
-        <w:t>memvars</w:t>
-      </w:r>
-      <w:proofErr w:type="spellEnd"/>
-      <w:r>
-        <w:t xml:space="preserve"> and fields, which makes FoxPro-style name resolution more reliable in larger source files</w:t>
+        <w:t>Added the XBaseNet dialect and the /fox3 compiler option for FoxPro-compatible dot syntax; /fox3 is also available as a pragma option and defines the __FOX3__ preprocessor symbol</w:t>
+      </w:r>
+    </w:p>
+    <w:p>
+      <w:pPr>
+        <w:numPr>
+          <w:ilvl w:val="0"/>
+          <w:numId w:val="2"/>
+        </w:numPr>
+      </w:pPr>
+      <w:r>
+        <w:t>Added support for FoxPro-style Cursor.Field expressions inside codeblocks when /fox3 is enabled, including better tracking of codeblock parameters during late binding</w:t>
+      </w:r>
+    </w:p>
+    <w:p>
+      <w:pPr>
+        <w:numPr>
+          <w:ilvl w:val="0"/>
+          <w:numId w:val="2"/>
+        </w:numPr>
+      </w:pPr>
+      <w:r>
+        <w:t>Improved compiler handling of file-wide memvars and fields, which makes FoxPro-style name resolution more reliable in larger source files</w:t>
       </w:r>
     </w:p>
     <w:p>
@@ -343,23 +301,7 @@
         </w:numPr>
       </w:pPr>
       <w:r>
-        <w:t xml:space="preserve">Fixed several /fox3 compatibility problems involving dot access to static and instance members, </w:t>
-      </w:r>
-      <w:proofErr w:type="spellStart"/>
-      <w:r>
-        <w:t>codeblocks</w:t>
-      </w:r>
-      <w:proofErr w:type="spellEnd"/>
-      <w:r>
-        <w:t>, PUBLIC variables, and the special THISFORM/</w:t>
-      </w:r>
-      <w:proofErr w:type="spellStart"/>
-      <w:r>
-        <w:t>FindForm</w:t>
-      </w:r>
-      <w:proofErr w:type="spellEnd"/>
-      <w:r>
-        <w:t xml:space="preserve"> rewriting rules (#2025, #2054, #2055, #2056, #2059, #2060)</w:t>
+        <w:t>Fixed several /fox3 compatibility problems involving dot access to static and instance members, codeblocks, PUBLIC variables, and the special THISFORM/FindForm rewriting rules (#2025, #2054, #2055, #2056, #2059, #2060)</w:t>
       </w:r>
     </w:p>
     <w:p>
@@ -414,143 +356,29 @@
         </w:numPr>
       </w:pPr>
       <w:r>
-        <w:t xml:space="preserve">Fixed duplicate import warnings for namespaces supplied through </w:t>
-      </w:r>
-      <w:proofErr w:type="spellStart"/>
-      <w:r>
-        <w:t>ImplicitNameSpace</w:t>
-      </w:r>
-      <w:proofErr w:type="spellEnd"/>
-      <w:r>
-        <w:t>/</w:t>
-      </w:r>
-      <w:proofErr w:type="spellStart"/>
-      <w:r>
-        <w:t>ClassLibrary</w:t>
-      </w:r>
-      <w:proofErr w:type="spellEnd"/>
-      <w:r>
-        <w:t xml:space="preserve"> attributes, and corrected problems with LOCAL ARRAY, PUBLIC ARRAY and DIMENSION declarations</w:t>
-      </w:r>
-    </w:p>
-    <w:p>
-      <w:pPr>
-        <w:numPr>
-          <w:ilvl w:val="0"/>
-          <w:numId w:val="2"/>
-        </w:numPr>
-      </w:pPr>
-      <w:proofErr w:type="spellStart"/>
-      <w:r>
-        <w:t>Fixed</w:t>
-      </w:r>
-      <w:proofErr w:type="spellEnd"/>
-      <w:r>
-        <w:t xml:space="preserve"> a </w:t>
-      </w:r>
-      <w:proofErr w:type="spellStart"/>
-      <w:r>
-        <w:t>NullReferenceException</w:t>
-      </w:r>
-      <w:proofErr w:type="spellEnd"/>
-      <w:r>
-        <w:t xml:space="preserve"> in </w:t>
-      </w:r>
-      <w:proofErr w:type="spellStart"/>
-      <w:r>
-        <w:t>SemanticModel</w:t>
-      </w:r>
-      <w:proofErr w:type="spellEnd"/>
-      <w:r>
-        <w:t xml:space="preserve"> </w:t>
-      </w:r>
-      <w:proofErr w:type="spellStart"/>
-      <w:r>
-        <w:t>queries</w:t>
-      </w:r>
-      <w:proofErr w:type="spellEnd"/>
-      <w:r>
-        <w:t xml:space="preserve"> on compound </w:t>
-      </w:r>
-      <w:proofErr w:type="spellStart"/>
-      <w:r>
-        <w:t>assignments</w:t>
-      </w:r>
-      <w:proofErr w:type="spellEnd"/>
-      <w:r>
-        <w:t xml:space="preserve"> (#2096)</w:t>
-      </w:r>
-    </w:p>
-    <w:p>
-      <w:pPr>
-        <w:numPr>
-          <w:ilvl w:val="0"/>
-          <w:numId w:val="2"/>
-        </w:numPr>
-      </w:pPr>
-      <w:proofErr w:type="spellStart"/>
-      <w:r>
-        <w:t>Fixed</w:t>
-      </w:r>
-      <w:proofErr w:type="spellEnd"/>
-      <w:r>
-        <w:t xml:space="preserve"> </w:t>
-      </w:r>
-      <w:proofErr w:type="spellStart"/>
-      <w:r>
-        <w:t>an</w:t>
-      </w:r>
-      <w:proofErr w:type="spellEnd"/>
-      <w:r>
-        <w:t xml:space="preserve"> </w:t>
-      </w:r>
-      <w:proofErr w:type="spellStart"/>
-      <w:r>
-        <w:t>IndexOutOfRangeException</w:t>
-      </w:r>
-      <w:proofErr w:type="spellEnd"/>
-      <w:r>
-        <w:t xml:space="preserve"> in </w:t>
-      </w:r>
-      <w:proofErr w:type="spellStart"/>
-      <w:r>
-        <w:t>the</w:t>
-      </w:r>
-      <w:proofErr w:type="spellEnd"/>
-      <w:r>
-        <w:t xml:space="preserve"> compiler </w:t>
-      </w:r>
-      <w:proofErr w:type="spellStart"/>
-      <w:r>
-        <w:t>when</w:t>
-      </w:r>
-      <w:proofErr w:type="spellEnd"/>
-      <w:r>
-        <w:t xml:space="preserve"> analyzers </w:t>
-      </w:r>
-      <w:proofErr w:type="spellStart"/>
-      <w:r>
-        <w:t>and</w:t>
-      </w:r>
-      <w:proofErr w:type="spellEnd"/>
-      <w:r>
-        <w:t xml:space="preserve"> .</w:t>
-      </w:r>
-      <w:proofErr w:type="spellStart"/>
-      <w:r>
-        <w:t>editorconfig</w:t>
-      </w:r>
-      <w:proofErr w:type="spellEnd"/>
-      <w:r>
-        <w:t xml:space="preserve"> files are </w:t>
-      </w:r>
-      <w:proofErr w:type="spellStart"/>
-      <w:r>
-        <w:t>used</w:t>
-      </w:r>
-      <w:proofErr w:type="spellEnd"/>
-      <w:r>
-        <w:t xml:space="preserve"> (#2098)</w:t>
+        <w:t>Fixed duplicate import warnings for namespaces supplied through ImplicitNameSpace/ClassLibrary attributes, and corrected problems with LOCAL ARRAY, PUBLIC ARRAY and DIMENSION declarations</w:t>
+      </w:r>
+    </w:p>
+    <w:p>
+      <w:pPr>
+        <w:numPr>
+          <w:ilvl w:val="0"/>
+          <w:numId w:val="2"/>
+        </w:numPr>
+      </w:pPr>
+      <w:r>
+        <w:t>Fixed a NullReferenceException in SemanticModel queries on compound assignments (#2096)</w:t>
+      </w:r>
+    </w:p>
+    <w:p>
+      <w:pPr>
+        <w:numPr>
+          <w:ilvl w:val="0"/>
+          <w:numId w:val="2"/>
+        </w:numPr>
+      </w:pPr>
+      <w:r>
+        <w:t>Fixed an IndexOutOfRangeException in the compiler when analyzers and .editorconfig files are used (#2098)</w:t>
       </w:r>
     </w:p>
     <w:p>
@@ -596,23 +424,13 @@
       <w:r>
         <w:t xml:space="preserve">Values set in </w:t>
       </w:r>
-      <w:proofErr w:type="spellStart"/>
       <w:proofErr w:type="gramStart"/>
       <w:r>
         <w:t>Directory.Build.Props</w:t>
       </w:r>
-      <w:proofErr w:type="spellEnd"/>
-      <w:proofErr w:type="gramEnd"/>
-      <w:r>
-        <w:t xml:space="preserve"> for </w:t>
-      </w:r>
-      <w:proofErr w:type="spellStart"/>
-      <w:r>
-        <w:t>DefaultItemExcludes</w:t>
-      </w:r>
-      <w:proofErr w:type="spellEnd"/>
-      <w:r>
-        <w:t xml:space="preserve"> are now preserved</w:t>
+      <w:proofErr w:type="gramEnd"/>
+      <w:r>
+        <w:t xml:space="preserve"> for DefaultItemExcludes are now preserved</w:t>
       </w:r>
     </w:p>
     <w:p>
@@ -672,39 +490,7 @@
         </w:numPr>
       </w:pPr>
       <w:r>
-        <w:t xml:space="preserve">The target </w:t>
-      </w:r>
-      <w:proofErr w:type="spellStart"/>
-      <w:r>
-        <w:t>framework</w:t>
-      </w:r>
-      <w:proofErr w:type="spellEnd"/>
-      <w:r>
-        <w:t xml:space="preserve"> of </w:t>
-      </w:r>
-      <w:proofErr w:type="spellStart"/>
-      <w:r>
-        <w:t>the</w:t>
-      </w:r>
-      <w:proofErr w:type="spellEnd"/>
-      <w:r>
-        <w:t xml:space="preserve"> X# </w:t>
-      </w:r>
-      <w:proofErr w:type="spellStart"/>
-      <w:r>
-        <w:t>runtime</w:t>
-      </w:r>
-      <w:proofErr w:type="spellEnd"/>
-      <w:r>
-        <w:t xml:space="preserve"> is </w:t>
-      </w:r>
-      <w:proofErr w:type="spellStart"/>
-      <w:r>
-        <w:t>now</w:t>
-      </w:r>
-      <w:proofErr w:type="spellEnd"/>
-      <w:r>
-        <w:t xml:space="preserve"> </w:t>
+        <w:t xml:space="preserve">The target framework of the X# runtime is now </w:t>
       </w:r>
       <w:r>
         <w:rPr>
@@ -856,23 +642,7 @@
         </w:numPr>
       </w:pPr>
       <w:r>
-        <w:t xml:space="preserve">Expanded </w:t>
-      </w:r>
-      <w:proofErr w:type="spellStart"/>
-      <w:r>
-        <w:t>XSharp.VFP.UI</w:t>
-      </w:r>
-      <w:proofErr w:type="spellEnd"/>
-      <w:r>
-        <w:t xml:space="preserve"> with ON KEY LABEL support, </w:t>
-      </w:r>
-      <w:proofErr w:type="spellStart"/>
-      <w:r>
-        <w:t>FormSet</w:t>
-      </w:r>
-      <w:proofErr w:type="spellEnd"/>
-      <w:r>
-        <w:t xml:space="preserve"> constructors, additional control properties, dynamic colors, and broader Grid and Menu support</w:t>
+        <w:t>Expanded XSharp.VFP.UI with ON KEY LABEL support, FormSet constructors, additional control properties, dynamic colors, and broader Grid and Menu support</w:t>
       </w:r>
     </w:p>
     <w:p>
@@ -930,15 +700,7 @@
         </w:numPr>
       </w:pPr>
       <w:r>
-        <w:t xml:space="preserve">Fixed SQLRDD crashes and data-integrity issues around reconnects, paging and EOF handling, delete and flush behavior, NULL and nullable ADS compatibility, tag lookup, index creation, Date and </w:t>
-      </w:r>
-      <w:proofErr w:type="spellStart"/>
-      <w:r>
-        <w:t>DateTime</w:t>
-      </w:r>
-      <w:proofErr w:type="spellEnd"/>
-      <w:r>
-        <w:t xml:space="preserve"> detection, and null-DataTable handling (#2035, #2044, #2050, #2058, #1984)</w:t>
+        <w:t>Fixed SQLRDD crashes and data-integrity issues around reconnects, paging and EOF handling, delete and flush behavior, NULL and nullable ADS compatibility, tag lookup, index creation, Date and DateTime detection, and null-DataTable handling (#2035, #2044, #2050, #2058, #1984)</w:t>
       </w:r>
     </w:p>
     <w:p>
@@ -968,42 +730,18 @@
         </w:numPr>
       </w:pPr>
       <w:r>
-        <w:t xml:space="preserve">Fixed </w:t>
-      </w:r>
-      <w:proofErr w:type="spellStart"/>
-      <w:r>
-        <w:t>Dbc.FindTable</w:t>
-      </w:r>
-      <w:proofErr w:type="spellEnd"/>
-      <w:r>
-        <w:t>() to accept either an alias or a file name, and corrected long field-name collisions in DBFs</w:t>
-      </w:r>
-    </w:p>
-    <w:p>
-      <w:pPr>
-        <w:numPr>
-          <w:ilvl w:val="0"/>
-          <w:numId w:val="2"/>
-        </w:numPr>
-      </w:pPr>
-      <w:r>
-        <w:t xml:space="preserve">Fixed several </w:t>
-      </w:r>
-      <w:proofErr w:type="spellStart"/>
-      <w:r>
-        <w:t>XSharp.VFP.UI</w:t>
-      </w:r>
-      <w:proofErr w:type="spellEnd"/>
-      <w:r>
-        <w:t xml:space="preserve"> problems in grids, record-pointer preservation, transparent controls, shapes, shortcut popups, property casing, </w:t>
-      </w:r>
-      <w:proofErr w:type="spellStart"/>
-      <w:r>
-        <w:t>InputMask</w:t>
-      </w:r>
-      <w:proofErr w:type="spellEnd"/>
-      <w:r>
-        <w:t xml:space="preserve"> and Format handling, and icon and form behavior</w:t>
+        <w:t>Fixed Dbc.FindTable() to accept either an alias or a file name, and corrected long field-name collisions in DBFs</w:t>
+      </w:r>
+    </w:p>
+    <w:p>
+      <w:pPr>
+        <w:numPr>
+          <w:ilvl w:val="0"/>
+          <w:numId w:val="2"/>
+        </w:numPr>
+      </w:pPr>
+      <w:r>
+        <w:t>Fixed several XSharp.VFP.UI problems in grids, record-pointer preservation, transparent controls, shapes, shortcut popups, property casing, InputMask and Format handling, and icon and form behavior</w:t>
       </w:r>
     </w:p>
     <w:p>
@@ -1024,317 +762,87 @@
           <w:numId w:val="2"/>
         </w:numPr>
       </w:pPr>
-      <w:proofErr w:type="spellStart"/>
-      <w:r>
-        <w:t>Fixed</w:t>
-      </w:r>
-      <w:proofErr w:type="spellEnd"/>
-      <w:r>
-        <w:t xml:space="preserve"> field </w:t>
-      </w:r>
-      <w:proofErr w:type="spellStart"/>
-      <w:r>
-        <w:t>and</w:t>
-      </w:r>
-      <w:proofErr w:type="spellEnd"/>
-      <w:r>
-        <w:t xml:space="preserve"> member </w:t>
-      </w:r>
-      <w:proofErr w:type="spellStart"/>
-      <w:r>
-        <w:t>lookup</w:t>
-      </w:r>
-      <w:proofErr w:type="spellEnd"/>
-      <w:r>
-        <w:t xml:space="preserve"> in __FieldGetWa2 </w:t>
-      </w:r>
-      <w:proofErr w:type="spellStart"/>
-      <w:r>
-        <w:t>for</w:t>
-      </w:r>
-      <w:proofErr w:type="spellEnd"/>
-      <w:r>
-        <w:t xml:space="preserve"> </w:t>
-      </w:r>
-      <w:proofErr w:type="spellStart"/>
-      <w:r>
-        <w:t>objects</w:t>
-      </w:r>
-      <w:proofErr w:type="spellEnd"/>
-      <w:r>
-        <w:t xml:space="preserve"> </w:t>
-      </w:r>
-      <w:proofErr w:type="spellStart"/>
-      <w:r>
-        <w:t>that</w:t>
-      </w:r>
-      <w:proofErr w:type="spellEnd"/>
-      <w:r>
-        <w:t xml:space="preserve"> support </w:t>
-      </w:r>
-      <w:proofErr w:type="spellStart"/>
-      <w:r>
-        <w:t>dynamic</w:t>
-      </w:r>
-      <w:proofErr w:type="spellEnd"/>
-      <w:r>
-        <w:t xml:space="preserve"> </w:t>
-      </w:r>
-      <w:proofErr w:type="spellStart"/>
-      <w:r>
-        <w:t>properties</w:t>
-      </w:r>
-      <w:proofErr w:type="spellEnd"/>
-      <w:r>
-        <w:t xml:space="preserve">, </w:t>
-      </w:r>
-      <w:proofErr w:type="spellStart"/>
-      <w:r>
-        <w:t>and</w:t>
-      </w:r>
-      <w:proofErr w:type="spellEnd"/>
-      <w:r>
-        <w:t xml:space="preserve"> </w:t>
-      </w:r>
-      <w:proofErr w:type="spellStart"/>
-      <w:r>
-        <w:t>improved</w:t>
-      </w:r>
-      <w:proofErr w:type="spellEnd"/>
-      <w:r>
-        <w:t xml:space="preserve"> </w:t>
-      </w:r>
-      <w:proofErr w:type="spellStart"/>
-      <w:r>
-        <w:t>the</w:t>
-      </w:r>
-      <w:proofErr w:type="spellEnd"/>
-      <w:r>
-        <w:t xml:space="preserve"> error </w:t>
-      </w:r>
-      <w:proofErr w:type="spellStart"/>
-      <w:r>
-        <w:t>that</w:t>
-      </w:r>
-      <w:proofErr w:type="spellEnd"/>
-      <w:r>
-        <w:t xml:space="preserve"> is </w:t>
-      </w:r>
-      <w:proofErr w:type="spellStart"/>
-      <w:r>
-        <w:t>thrown</w:t>
-      </w:r>
-      <w:proofErr w:type="spellEnd"/>
-      <w:r>
-        <w:t xml:space="preserve"> </w:t>
-      </w:r>
-      <w:proofErr w:type="spellStart"/>
-      <w:r>
-        <w:t>when</w:t>
-      </w:r>
-      <w:proofErr w:type="spellEnd"/>
-      <w:r>
-        <w:t xml:space="preserve"> a </w:t>
-      </w:r>
-      <w:proofErr w:type="spellStart"/>
-      <w:r>
-        <w:t>variable</w:t>
-      </w:r>
-      <w:proofErr w:type="spellEnd"/>
-      <w:r>
-        <w:t xml:space="preserve"> </w:t>
-      </w:r>
-      <w:proofErr w:type="spellStart"/>
-      <w:r>
-        <w:t>cannot</w:t>
-      </w:r>
-      <w:proofErr w:type="spellEnd"/>
-      <w:r>
-        <w:t xml:space="preserve"> </w:t>
-      </w:r>
-      <w:proofErr w:type="spellStart"/>
-      <w:r>
-        <w:t>be</w:t>
-      </w:r>
-      <w:proofErr w:type="spellEnd"/>
-      <w:r>
-        <w:t xml:space="preserve"> found (#2092)</w:t>
-      </w:r>
-    </w:p>
-    <w:p>
-      <w:pPr>
-        <w:numPr>
-          <w:ilvl w:val="0"/>
-          <w:numId w:val="2"/>
-        </w:numPr>
-      </w:pPr>
-      <w:proofErr w:type="spellStart"/>
-      <w:r>
-        <w:t>Fixed</w:t>
-      </w:r>
-      <w:proofErr w:type="spellEnd"/>
-      <w:r>
-        <w:t xml:space="preserve"> </w:t>
-      </w:r>
-      <w:proofErr w:type="spellStart"/>
-      <w:r>
-        <w:t>the</w:t>
-      </w:r>
-      <w:proofErr w:type="spellEnd"/>
-      <w:r>
-        <w:t xml:space="preserve"> </w:t>
-      </w:r>
-      <w:proofErr w:type="spellStart"/>
-      <w:r>
-        <w:t>usCulture</w:t>
-      </w:r>
-      <w:proofErr w:type="spellEnd"/>
-      <w:r>
-        <w:t xml:space="preserve"> </w:t>
-      </w:r>
-      <w:proofErr w:type="spellStart"/>
-      <w:r>
-        <w:t>used</w:t>
-      </w:r>
-      <w:proofErr w:type="spellEnd"/>
-      <w:r>
-        <w:t xml:space="preserve"> </w:t>
-      </w:r>
-      <w:proofErr w:type="spellStart"/>
-      <w:r>
-        <w:t>for</w:t>
-      </w:r>
-      <w:proofErr w:type="spellEnd"/>
-      <w:r>
-        <w:t xml:space="preserve"> </w:t>
-      </w:r>
-      <w:proofErr w:type="spellStart"/>
-      <w:r>
-        <w:t>conversions</w:t>
-      </w:r>
-      <w:proofErr w:type="spellEnd"/>
-      <w:r>
-        <w:t xml:space="preserve"> </w:t>
-      </w:r>
-      <w:proofErr w:type="spellStart"/>
-      <w:r>
-        <w:t>so</w:t>
-      </w:r>
-      <w:proofErr w:type="spellEnd"/>
-      <w:r>
-        <w:t xml:space="preserve"> </w:t>
-      </w:r>
-      <w:proofErr w:type="spellStart"/>
-      <w:r>
-        <w:t>it</w:t>
-      </w:r>
-      <w:proofErr w:type="spellEnd"/>
-      <w:r>
-        <w:t xml:space="preserve"> </w:t>
-      </w:r>
-      <w:proofErr w:type="spellStart"/>
-      <w:r>
-        <w:t>ignores</w:t>
-      </w:r>
-      <w:proofErr w:type="spellEnd"/>
-      <w:r>
-        <w:t xml:space="preserve"> Windows user </w:t>
-      </w:r>
-      <w:proofErr w:type="spellStart"/>
-      <w:r>
-        <w:t>overrides</w:t>
-      </w:r>
-      <w:proofErr w:type="spellEnd"/>
-      <w:r>
-        <w:t xml:space="preserve">; </w:t>
-      </w:r>
-      <w:proofErr w:type="spellStart"/>
-      <w:r>
-        <w:t>this</w:t>
-      </w:r>
-      <w:proofErr w:type="spellEnd"/>
-      <w:r>
-        <w:t xml:space="preserve"> </w:t>
-      </w:r>
-      <w:proofErr w:type="spellStart"/>
-      <w:r>
-        <w:t>fixes</w:t>
-      </w:r>
-      <w:proofErr w:type="spellEnd"/>
-      <w:r>
-        <w:t xml:space="preserve"> Val(), </w:t>
-      </w:r>
-      <w:proofErr w:type="spellStart"/>
-      <w:r>
-        <w:t>Str</w:t>
-      </w:r>
-      <w:proofErr w:type="spellEnd"/>
-      <w:r>
-        <w:t xml:space="preserve">() </w:t>
-      </w:r>
-      <w:proofErr w:type="spellStart"/>
-      <w:r>
-        <w:t>and</w:t>
-      </w:r>
-      <w:proofErr w:type="spellEnd"/>
-      <w:r>
-        <w:t xml:space="preserve"> </w:t>
-      </w:r>
-      <w:proofErr w:type="spellStart"/>
-      <w:r>
-        <w:t>Transform</w:t>
-      </w:r>
-      <w:proofErr w:type="spellEnd"/>
-      <w:r>
-        <w:t xml:space="preserve">() </w:t>
-      </w:r>
-      <w:proofErr w:type="spellStart"/>
-      <w:r>
-        <w:t>when</w:t>
-      </w:r>
-      <w:proofErr w:type="spellEnd"/>
-      <w:r>
-        <w:t xml:space="preserve"> </w:t>
-      </w:r>
-      <w:proofErr w:type="spellStart"/>
-      <w:r>
-        <w:t>the</w:t>
-      </w:r>
-      <w:proofErr w:type="spellEnd"/>
-      <w:r>
-        <w:t xml:space="preserve"> user has a </w:t>
-      </w:r>
-      <w:proofErr w:type="spellStart"/>
-      <w:r>
-        <w:t>custom</w:t>
-      </w:r>
-      <w:proofErr w:type="spellEnd"/>
-      <w:r>
-        <w:t xml:space="preserve"> </w:t>
-      </w:r>
-      <w:proofErr w:type="spellStart"/>
-      <w:r>
-        <w:t>decimal</w:t>
-      </w:r>
-      <w:proofErr w:type="spellEnd"/>
-      <w:r>
-        <w:t xml:space="preserve"> </w:t>
-      </w:r>
-      <w:proofErr w:type="spellStart"/>
-      <w:r>
-        <w:t>symbol</w:t>
-      </w:r>
-      <w:proofErr w:type="spellEnd"/>
-      <w:r>
-        <w:t xml:space="preserve"> or digit </w:t>
-      </w:r>
-      <w:proofErr w:type="spellStart"/>
-      <w:r>
-        <w:t>grouping</w:t>
-      </w:r>
-      <w:proofErr w:type="spellEnd"/>
-      <w:r>
-        <w:t xml:space="preserve"> (#2100)</w:t>
+      <w:r>
+        <w:t>Fixed field and member lookup in __FieldGetWa2 for objects that support dynamic properties, and improved the error that is thrown when a variable cannot be found (#2092)</w:t>
+      </w:r>
+    </w:p>
+    <w:p>
+      <w:pPr>
+        <w:numPr>
+          <w:ilvl w:val="0"/>
+          <w:numId w:val="2"/>
+        </w:numPr>
+      </w:pPr>
+      <w:r>
+        <w:t xml:space="preserve">Fixed the usCulture used for conversions so it ignores Windows user overrides; this fixes </w:t>
+      </w:r>
+      <w:proofErr w:type="gramStart"/>
+      <w:r>
+        <w:t>Val(</w:t>
+      </w:r>
+      <w:proofErr w:type="gramEnd"/>
+      <w:r>
+        <w:t xml:space="preserve">), </w:t>
+      </w:r>
+      <w:proofErr w:type="gramStart"/>
+      <w:r>
+        <w:t>Str(</w:t>
+      </w:r>
+      <w:proofErr w:type="gramEnd"/>
+      <w:r>
+        <w:t xml:space="preserve">) and </w:t>
+      </w:r>
+      <w:proofErr w:type="gramStart"/>
+      <w:r>
+        <w:t>Transform(</w:t>
+      </w:r>
+      <w:proofErr w:type="gramEnd"/>
+      <w:r>
+        <w:t>) when the user has a custom decimal symbol or digit grouping (#2100)</w:t>
+      </w:r>
+    </w:p>
+    <w:p>
+      <w:pPr>
+        <w:numPr>
+          <w:ilvl w:val="0"/>
+          <w:numId w:val="2"/>
+        </w:numPr>
+      </w:pPr>
+      <w:r>
+        <w:t>Fixed an issue with rounding small negative numbers (-0.0) with new .Net versions #2104</w:t>
+      </w:r>
+    </w:p>
+    <w:p>
+      <w:pPr>
+        <w:numPr>
+          <w:ilvl w:val="0"/>
+          <w:numId w:val="2"/>
+        </w:numPr>
+      </w:pPr>
+      <w:r>
+        <w:t>Fixed an issue with FindClass for types that are not yet loaded #2109</w:t>
+      </w:r>
+    </w:p>
+    <w:p>
+      <w:pPr>
+        <w:numPr>
+          <w:ilvl w:val="0"/>
+          <w:numId w:val="2"/>
+        </w:numPr>
+      </w:pPr>
+      <w:r>
+        <w:t>Nested codeblocks in macro scripts can now access locals from the surroundng code #2113</w:t>
+      </w:r>
+    </w:p>
+    <w:p>
+      <w:pPr>
+        <w:numPr>
+          <w:ilvl w:val="0"/>
+          <w:numId w:val="2"/>
+        </w:numPr>
+      </w:pPr>
+      <w:r>
+        <w:t>Allow implicit interface conversions in macros (#2114)</w:t>
       </w:r>
     </w:p>
     <w:p>
@@ -1342,6 +850,7 @@
         <w:pStyle w:val="Heading2"/>
       </w:pPr>
       <w:r>
+        <w:lastRenderedPageBreak/>
         <w:t>Visual Studio Integration</w:t>
       </w:r>
     </w:p>
@@ -1350,7 +859,6 @@
         <w:pStyle w:val="Heading3"/>
       </w:pPr>
       <w:r>
-        <w:lastRenderedPageBreak/>
         <w:t>New Features</w:t>
       </w:r>
     </w:p>
@@ -1403,15 +911,7 @@
         </w:numPr>
       </w:pPr>
       <w:r>
-        <w:t xml:space="preserve">Updated Visual Studio integration for the new FoxPro and </w:t>
-      </w:r>
-      <w:proofErr w:type="spellStart"/>
-      <w:r>
-        <w:t>XBaseNet</w:t>
-      </w:r>
-      <w:proofErr w:type="spellEnd"/>
-      <w:r>
-        <w:t xml:space="preserve"> compiler options, including /fox3-aware settings and parser support for newer language constructs</w:t>
+        <w:t>Updated Visual Studio integration for the new FoxPro and XBaseNet compiler options, including /fox3-aware settings and parser support for newer language constructs</w:t>
       </w:r>
     </w:p>
     <w:p>
@@ -1432,136 +932,19 @@
           <w:numId w:val="2"/>
         </w:numPr>
       </w:pPr>
-      <w:proofErr w:type="spellStart"/>
-      <w:r>
-        <w:t>Implemented</w:t>
-      </w:r>
-      <w:proofErr w:type="spellEnd"/>
-      <w:r>
-        <w:t xml:space="preserve"> </w:t>
-      </w:r>
-      <w:proofErr w:type="spellStart"/>
-      <w:r>
-        <w:t>the</w:t>
-      </w:r>
-      <w:proofErr w:type="spellEnd"/>
-      <w:r>
-        <w:t xml:space="preserve"> Project context menu option "</w:t>
-      </w:r>
-      <w:proofErr w:type="spellStart"/>
-      <w:r>
-        <w:t>Convert</w:t>
-      </w:r>
-      <w:proofErr w:type="spellEnd"/>
-      <w:r>
-        <w:t xml:space="preserve"> </w:t>
-      </w:r>
-      <w:proofErr w:type="spellStart"/>
-      <w:r>
-        <w:t>to</w:t>
-      </w:r>
-      <w:proofErr w:type="spellEnd"/>
-      <w:r>
-        <w:t xml:space="preserve"> SDK format" </w:t>
-      </w:r>
-      <w:proofErr w:type="spellStart"/>
-      <w:r>
-        <w:t>for</w:t>
-      </w:r>
-      <w:proofErr w:type="spellEnd"/>
-      <w:r>
-        <w:t xml:space="preserve"> </w:t>
-      </w:r>
-      <w:proofErr w:type="spellStart"/>
-      <w:r>
-        <w:t>projects</w:t>
-      </w:r>
-      <w:proofErr w:type="spellEnd"/>
-      <w:r>
-        <w:t xml:space="preserve"> in </w:t>
-      </w:r>
-      <w:proofErr w:type="spellStart"/>
-      <w:r>
-        <w:t>the</w:t>
-      </w:r>
-      <w:proofErr w:type="spellEnd"/>
-      <w:r>
-        <w:t xml:space="preserve"> </w:t>
-      </w:r>
-      <w:proofErr w:type="spellStart"/>
-      <w:r>
-        <w:t>legacy</w:t>
-      </w:r>
-      <w:proofErr w:type="spellEnd"/>
-      <w:r>
-        <w:t xml:space="preserve"> format. The </w:t>
-      </w:r>
-      <w:proofErr w:type="spellStart"/>
-      <w:r>
-        <w:t>old</w:t>
-      </w:r>
-      <w:proofErr w:type="spellEnd"/>
-      <w:r>
-        <w:t xml:space="preserve"> project file is </w:t>
-      </w:r>
-      <w:proofErr w:type="spellStart"/>
-      <w:r>
-        <w:t>saved</w:t>
-      </w:r>
-      <w:proofErr w:type="spellEnd"/>
-      <w:r>
-        <w:t xml:space="preserve"> with a .BAK extension.</w:t>
-      </w:r>
-    </w:p>
-    <w:p>
-      <w:pPr>
-        <w:numPr>
-          <w:ilvl w:val="0"/>
-          <w:numId w:val="2"/>
-        </w:numPr>
-      </w:pPr>
-      <w:r>
-        <w:t xml:space="preserve">The project Property pages are </w:t>
-      </w:r>
-      <w:proofErr w:type="spellStart"/>
-      <w:r>
-        <w:t>now</w:t>
-      </w:r>
-      <w:proofErr w:type="spellEnd"/>
-      <w:r>
-        <w:t xml:space="preserve"> </w:t>
-      </w:r>
-      <w:proofErr w:type="spellStart"/>
-      <w:r>
-        <w:t>based</w:t>
-      </w:r>
-      <w:proofErr w:type="spellEnd"/>
-      <w:r>
-        <w:t xml:space="preserve"> on </w:t>
-      </w:r>
-      <w:proofErr w:type="spellStart"/>
-      <w:r>
-        <w:t>the</w:t>
-      </w:r>
-      <w:proofErr w:type="spellEnd"/>
-      <w:r>
-        <w:t xml:space="preserve"> XAML files in </w:t>
-      </w:r>
-      <w:proofErr w:type="spellStart"/>
-      <w:r>
-        <w:t>the</w:t>
-      </w:r>
-      <w:proofErr w:type="spellEnd"/>
-      <w:r>
-        <w:t xml:space="preserve"> </w:t>
-      </w:r>
-      <w:proofErr w:type="spellStart"/>
-      <w:r>
-        <w:t>MsBuild</w:t>
-      </w:r>
-      <w:proofErr w:type="spellEnd"/>
-      <w:r>
-        <w:t xml:space="preserve"> Rules folder</w:t>
+      <w:r>
+        <w:t>Implemented the Project context menu option "Convert to SDK format" for projects in the legacy format. The old project file is saved with a .BAK extension.</w:t>
+      </w:r>
+    </w:p>
+    <w:p>
+      <w:pPr>
+        <w:numPr>
+          <w:ilvl w:val="0"/>
+          <w:numId w:val="2"/>
+        </w:numPr>
+      </w:pPr>
+      <w:r>
+        <w:t>The project Property pages are now based on the XAML files in the MsBuild Rules folder</w:t>
       </w:r>
     </w:p>
     <w:p>
@@ -1620,11 +1003,9 @@
       <w:pPr>
         <w:pStyle w:val="Heading2"/>
       </w:pPr>
-      <w:proofErr w:type="spellStart"/>
       <w:r>
         <w:t>VFPExporter</w:t>
       </w:r>
-      <w:proofErr w:type="spellEnd"/>
     </w:p>
     <w:p>
       <w:pPr>
@@ -1642,15 +1023,7 @@
         </w:numPr>
       </w:pPr>
       <w:r>
-        <w:t xml:space="preserve">Added a </w:t>
-      </w:r>
-      <w:proofErr w:type="spellStart"/>
-      <w:r>
-        <w:t>KeepFolderStructure</w:t>
-      </w:r>
-      <w:proofErr w:type="spellEnd"/>
-      <w:r>
-        <w:t xml:space="preserve"> option so exported projects can preserve the original VFP folder tree</w:t>
+        <w:t>Added a KeepFolderStructure option so exported projects can preserve the original VFP folder tree</w:t>
       </w:r>
     </w:p>
     <w:p>
@@ -1683,24 +1056,11 @@
         </w:numPr>
       </w:pPr>
       <w:r>
-        <w:t xml:space="preserve">Added WITH/ENDWITH expansion during export, plus better </w:t>
-      </w:r>
-      <w:proofErr w:type="spellStart"/>
-      <w:r>
-        <w:t>ClassName</w:t>
-      </w:r>
-      <w:proofErr w:type="spellEnd"/>
-      <w:r>
-        <w:t xml:space="preserve">-prefix handling and prefix-aware </w:t>
-      </w:r>
-      <w:proofErr w:type="spellStart"/>
-      <w:proofErr w:type="gramStart"/>
-      <w:r>
-        <w:t>CreateObject</w:t>
-      </w:r>
-      <w:proofErr w:type="spellEnd"/>
-      <w:r>
-        <w:t>(</w:t>
+        <w:t xml:space="preserve">Added WITH/ENDWITH expansion during export, plus better ClassName-prefix handling and prefix-aware </w:t>
+      </w:r>
+      <w:proofErr w:type="gramStart"/>
+      <w:r>
+        <w:t>CreateObject(</w:t>
       </w:r>
       <w:proofErr w:type="gramEnd"/>
       <w:r>
@@ -1715,42 +1075,18 @@
         </w:numPr>
       </w:pPr>
       <w:r>
-        <w:t xml:space="preserve">Added </w:t>
-      </w:r>
-      <w:proofErr w:type="spellStart"/>
-      <w:r>
-        <w:t>PageFrame</w:t>
-      </w:r>
-      <w:proofErr w:type="spellEnd"/>
-      <w:r>
-        <w:t xml:space="preserve"> and Page typed-class export, plus </w:t>
-      </w:r>
-      <w:proofErr w:type="spellStart"/>
-      <w:r>
-        <w:t>ReportListener</w:t>
-      </w:r>
-      <w:proofErr w:type="spellEnd"/>
-      <w:r>
-        <w:t xml:space="preserve"> support</w:t>
-      </w:r>
-    </w:p>
-    <w:p>
-      <w:pPr>
-        <w:numPr>
-          <w:ilvl w:val="0"/>
-          <w:numId w:val="2"/>
-        </w:numPr>
-      </w:pPr>
-      <w:r>
-        <w:t xml:space="preserve">Added DBC metadata injection during export (Caption, </w:t>
-      </w:r>
-      <w:proofErr w:type="spellStart"/>
-      <w:r>
-        <w:t>InputMask</w:t>
-      </w:r>
-      <w:proofErr w:type="spellEnd"/>
-      <w:r>
-        <w:t xml:space="preserve"> and Format) and copying of DBC-owned tables and companion files</w:t>
+        <w:t>Added PageFrame and Page typed-class export, plus ReportListener support</w:t>
+      </w:r>
+    </w:p>
+    <w:p>
+      <w:pPr>
+        <w:numPr>
+          <w:ilvl w:val="0"/>
+          <w:numId w:val="2"/>
+        </w:numPr>
+      </w:pPr>
+      <w:r>
+        <w:t>Added DBC metadata injection during export (Caption, InputMask and Format) and copying of DBC-owned tables and companion files</w:t>
       </w:r>
     </w:p>
     <w:p>
@@ -1826,95 +1162,42 @@
       <w:r>
         <w:t xml:space="preserve">Fixed output-folder handling, destination-folder cleanup, file-deletion messages, and missing </w:t>
       </w:r>
-      <w:proofErr w:type="spellStart"/>
-      <w:r>
-        <w:t>ColorProperties.json</w:t>
-      </w:r>
-      <w:proofErr w:type="spellEnd"/>
-      <w:r>
-        <w:t xml:space="preserve"> deployment</w:t>
-      </w:r>
-    </w:p>
-    <w:p>
-      <w:pPr>
-        <w:numPr>
-          <w:ilvl w:val="0"/>
-          <w:numId w:val="2"/>
-        </w:numPr>
-      </w:pPr>
       <w:r>
         <w:lastRenderedPageBreak/>
-        <w:t xml:space="preserve">Fixed </w:t>
-      </w:r>
-      <w:proofErr w:type="spellStart"/>
-      <w:r>
-        <w:t>PropRules</w:t>
-      </w:r>
-      <w:proofErr w:type="spellEnd"/>
-      <w:r>
-        <w:t xml:space="preserve"> for </w:t>
-      </w:r>
-      <w:proofErr w:type="spellStart"/>
-      <w:r>
-        <w:t>RightToLeft</w:t>
-      </w:r>
-      <w:proofErr w:type="spellEnd"/>
-      <w:r>
-        <w:t xml:space="preserve">, </w:t>
-      </w:r>
-      <w:proofErr w:type="spellStart"/>
-      <w:r>
-        <w:t>BorderStyle</w:t>
-      </w:r>
-      <w:proofErr w:type="spellEnd"/>
-      <w:r>
-        <w:t xml:space="preserve">, </w:t>
-      </w:r>
-      <w:proofErr w:type="spellStart"/>
-      <w:r>
-        <w:t>DisabledColors</w:t>
-      </w:r>
-      <w:proofErr w:type="spellEnd"/>
-      <w:r>
-        <w:t>, Icon, Picture, and dotted child-property overrides</w:t>
-      </w:r>
-    </w:p>
-    <w:p>
-      <w:pPr>
-        <w:numPr>
-          <w:ilvl w:val="0"/>
-          <w:numId w:val="2"/>
-        </w:numPr>
-      </w:pPr>
-      <w:r>
-        <w:t xml:space="preserve">Fixed event-handler generation for multi-line LPARAMETERS and </w:t>
-      </w:r>
-      <w:proofErr w:type="spellStart"/>
-      <w:r>
-        <w:t>OptionGroup</w:t>
-      </w:r>
-      <w:proofErr w:type="spellEnd"/>
-      <w:r>
-        <w:t xml:space="preserve"> sub-control event names</w:t>
-      </w:r>
-    </w:p>
-    <w:p>
-      <w:pPr>
-        <w:numPr>
-          <w:ilvl w:val="0"/>
-          <w:numId w:val="2"/>
-        </w:numPr>
-      </w:pPr>
-      <w:r>
-        <w:t xml:space="preserve">Fixed </w:t>
-      </w:r>
-      <w:proofErr w:type="spellStart"/>
-      <w:r>
-        <w:t>FormSet</w:t>
-      </w:r>
-      <w:proofErr w:type="spellEnd"/>
-      <w:r>
-        <w:t>, form and menu export problems, menu MNX parsing and captions, generated project-reference paths, and DBC and DBF runtime path handling for free tables and OPEN DATABASE</w:t>
+        <w:t>ColorProperties.json deployment</w:t>
+      </w:r>
+    </w:p>
+    <w:p>
+      <w:pPr>
+        <w:numPr>
+          <w:ilvl w:val="0"/>
+          <w:numId w:val="2"/>
+        </w:numPr>
+      </w:pPr>
+      <w:r>
+        <w:t>Fixed PropRules for RightToLeft, BorderStyle, DisabledColors, Icon, Picture, and dotted child-property overrides</w:t>
+      </w:r>
+    </w:p>
+    <w:p>
+      <w:pPr>
+        <w:numPr>
+          <w:ilvl w:val="0"/>
+          <w:numId w:val="2"/>
+        </w:numPr>
+      </w:pPr>
+      <w:r>
+        <w:t>Fixed event-handler generation for multi-line LPARAMETERS and OptionGroup sub-control event names</w:t>
+      </w:r>
+    </w:p>
+    <w:p>
+      <w:pPr>
+        <w:numPr>
+          <w:ilvl w:val="0"/>
+          <w:numId w:val="2"/>
+        </w:numPr>
+      </w:pPr>
+      <w:r>
+        <w:t>Fixed FormSet, form and menu export problems, menu MNX parsing and captions, generated project-reference paths, and DBC and DBF runtime path handling for free tables and OPEN DATABASE</w:t>
       </w:r>
     </w:p>
     <w:p/>
@@ -1981,56 +1264,19 @@
         </w:numPr>
       </w:pPr>
       <w:r>
-        <w:t xml:space="preserve">The compiler no longer supports "Bring Your Own Runtime". If you want to compile in the VO or Vulcan dialect you will HAVE to include references to </w:t>
-      </w:r>
-      <w:proofErr w:type="spellStart"/>
-      <w:r>
-        <w:t>XSharp.Core</w:t>
-      </w:r>
-      <w:proofErr w:type="spellEnd"/>
-      <w:r>
-        <w:t xml:space="preserve"> and </w:t>
-      </w:r>
-      <w:proofErr w:type="spellStart"/>
-      <w:r>
-        <w:t>XSharp.RT</w:t>
-      </w:r>
-      <w:proofErr w:type="spellEnd"/>
-      <w:r>
-        <w:t>.</w:t>
+        <w:t>The compiler no longer supports "Bring Your Own Runtime". If you want to compile in the VO or Vulcan dialect you will HAVE to include references to XSharp.Core and XSharp.RT.</w:t>
       </w:r>
       <w:r>
         <w:br/>
-        <w:t xml:space="preserve">That does not mean that you can't link your program against the Vulcan runtime DLLs, but we no longer map our </w:t>
-      </w:r>
-      <w:proofErr w:type="spellStart"/>
-      <w:r>
-        <w:t>Xbase</w:t>
-      </w:r>
-      <w:proofErr w:type="spellEnd"/>
-      <w:r>
-        <w:t xml:space="preserve"> types to the types in these DLLs. So USUAL will not be mapped to </w:t>
-      </w:r>
-      <w:proofErr w:type="spellStart"/>
+        <w:t xml:space="preserve">That does not mean that you can't link your program against the Vulcan runtime DLLs, but we no longer map our Xbase types to the types in these DLLs. So USUAL will not be mapped to </w:t>
+      </w:r>
       <w:proofErr w:type="gramStart"/>
       <w:r>
         <w:t>Vulcan._</w:t>
       </w:r>
       <w:proofErr w:type="gramEnd"/>
       <w:r>
-        <w:t>_Usual</w:t>
-      </w:r>
-      <w:proofErr w:type="spellEnd"/>
-      <w:r>
-        <w:t xml:space="preserve">. You can still use the types, functions and classes on these DLLs, but they will no longer be treated specially. If you want to call a function from the Vulcan Runtime </w:t>
-      </w:r>
-      <w:proofErr w:type="spellStart"/>
-      <w:r>
-        <w:t>yuou</w:t>
-      </w:r>
-      <w:proofErr w:type="spellEnd"/>
-      <w:r>
-        <w:t xml:space="preserve"> will have to use the syntax for static methods</w:t>
+        <w:t>_Usual. You can still use the types, functions and classes on these DLLs, but they will no longer be treated specially. If you want to call a function from the Vulcan Runtime yuou will have to use the syntax for static methods</w:t>
       </w:r>
     </w:p>
     <w:p>
@@ -2107,50 +1353,27 @@
         </w:numPr>
       </w:pPr>
       <w:r>
-        <w:t>We have added code to check for the new [</w:t>
-      </w:r>
-      <w:proofErr w:type="spellStart"/>
-      <w:r>
-        <w:t>FoxArrayResultAttribute</w:t>
-      </w:r>
-      <w:proofErr w:type="spellEnd"/>
-      <w:r>
-        <w:t xml:space="preserve">] that marks VFP functions which may create an array as a result (such as </w:t>
-      </w:r>
-      <w:proofErr w:type="spellStart"/>
-      <w:proofErr w:type="gramStart"/>
-      <w:r>
-        <w:t>AMembers</w:t>
-      </w:r>
-      <w:proofErr w:type="spellEnd"/>
-      <w:r>
-        <w:t>(</w:t>
+        <w:t xml:space="preserve">We have added code to check for the new [FoxArrayResultAttribute] that marks VFP functions which may create an array as a result (such as </w:t>
+      </w:r>
+      <w:proofErr w:type="gramStart"/>
+      <w:r>
+        <w:t>AMembers(</w:t>
       </w:r>
       <w:proofErr w:type="gramEnd"/>
       <w:r>
         <w:t xml:space="preserve">), </w:t>
       </w:r>
-      <w:proofErr w:type="spellStart"/>
-      <w:proofErr w:type="gramStart"/>
-      <w:r>
-        <w:t>APrinters</w:t>
-      </w:r>
-      <w:proofErr w:type="spellEnd"/>
-      <w:r>
-        <w:t>(</w:t>
+      <w:proofErr w:type="gramStart"/>
+      <w:r>
+        <w:t>APrinters(</w:t>
       </w:r>
       <w:proofErr w:type="gramEnd"/>
       <w:r>
         <w:t xml:space="preserve">) and </w:t>
       </w:r>
-      <w:proofErr w:type="spellStart"/>
-      <w:proofErr w:type="gramStart"/>
-      <w:r>
-        <w:t>AUsed</w:t>
-      </w:r>
-      <w:proofErr w:type="spellEnd"/>
-      <w:r>
-        <w:t>(</w:t>
+      <w:proofErr w:type="gramStart"/>
+      <w:r>
+        <w:t>AUsed(</w:t>
       </w:r>
       <w:proofErr w:type="gramEnd"/>
       <w:r>
@@ -2190,15 +1413,7 @@
         </w:numPr>
       </w:pPr>
       <w:r>
-        <w:t xml:space="preserve">Suppressed a false ambiguity warning when a member has two overloads where one is </w:t>
-      </w:r>
-      <w:proofErr w:type="spellStart"/>
-      <w:r>
-        <w:t>parameterless</w:t>
-      </w:r>
-      <w:proofErr w:type="spellEnd"/>
-      <w:r>
-        <w:t xml:space="preserve"> and the other uses the Clipper calling convention; the compiler now silently chooses the parameter-less overload</w:t>
+        <w:t>Suppressed a false ambiguity warning when a member has two overloads where one is parameterless and the other uses the Clipper calling convention; the compiler now silently chooses the parameter-less overload</w:t>
       </w:r>
     </w:p>
     <w:p>
@@ -2209,15 +1424,7 @@
         </w:numPr>
       </w:pPr>
       <w:r>
-        <w:t xml:space="preserve">Fixed an issue with </w:t>
-      </w:r>
-      <w:proofErr w:type="spellStart"/>
-      <w:r>
-        <w:t>cref</w:t>
-      </w:r>
-      <w:proofErr w:type="spellEnd"/>
-      <w:r>
-        <w:t xml:space="preserve"> attributes that are read from include files</w:t>
+        <w:t>Fixed an issue with cref attributes that are read from include files</w:t>
       </w:r>
     </w:p>
     <w:p>
@@ -2228,31 +1435,7 @@
         </w:numPr>
       </w:pPr>
       <w:r>
-        <w:t>Fixed an “Failed to emit module” error when the code contains an expression in the form of “</w:t>
-      </w:r>
-      <w:proofErr w:type="spellStart"/>
-      <w:r>
-        <w:t>UnnamedType.Property</w:t>
-      </w:r>
-      <w:proofErr w:type="spellEnd"/>
-      <w:r>
-        <w:t>” or “</w:t>
-      </w:r>
-      <w:proofErr w:type="spellStart"/>
-      <w:r>
-        <w:t>UnnamedType.Method</w:t>
-      </w:r>
-      <w:proofErr w:type="spellEnd"/>
-      <w:r>
-        <w:t>()” when the “</w:t>
-      </w:r>
-      <w:proofErr w:type="spellStart"/>
-      <w:r>
-        <w:t>allowdot</w:t>
-      </w:r>
-      <w:proofErr w:type="spellEnd"/>
-      <w:r>
-        <w:t>” compiler option is enabled.</w:t>
+        <w:t>Fixed an “Failed to emit module” error when the code contains an expression in the form of “UnnamedType.Property” or “UnnamedType.Method()” when the “allowdot” compiler option is enabled.</w:t>
       </w:r>
     </w:p>
     <w:p>
@@ -2329,17 +1512,12 @@
         </w:numPr>
       </w:pPr>
       <w:r>
+        <w:lastRenderedPageBreak/>
         <w:t xml:space="preserve">Changed the UDC for the RECALL command, because FoxPro temporarily switches of the </w:t>
       </w:r>
-      <w:proofErr w:type="spellStart"/>
-      <w:proofErr w:type="gramStart"/>
-      <w:r>
-        <w:lastRenderedPageBreak/>
-        <w:t>SetDeleted</w:t>
-      </w:r>
-      <w:proofErr w:type="spellEnd"/>
-      <w:r>
-        <w:t>(</w:t>
+      <w:proofErr w:type="gramStart"/>
+      <w:r>
+        <w:t>SetDeleted(</w:t>
       </w:r>
       <w:proofErr w:type="gramEnd"/>
       <w:r>
@@ -2354,15 +1532,7 @@
         </w:numPr>
       </w:pPr>
       <w:r>
-        <w:t xml:space="preserve">Prevented an assertion error when compiling in debug mode for functions with the </w:t>
-      </w:r>
-      <w:proofErr w:type="spellStart"/>
-      <w:r>
-        <w:t>NeedsAccessToLocal</w:t>
-      </w:r>
-      <w:proofErr w:type="spellEnd"/>
-      <w:r>
-        <w:t xml:space="preserve"> attribute and a VOID return type (#1870)</w:t>
+        <w:t>Prevented an assertion error when compiling in debug mode for functions with the NeedsAccessToLocal attribute and a VOID return type (#1870)</w:t>
       </w:r>
     </w:p>
     <w:p>
@@ -2489,15 +1659,7 @@
         </w:numPr>
       </w:pPr>
       <w:r>
-        <w:t xml:space="preserve">The XAML files in the Rules subfolder of the </w:t>
-      </w:r>
-      <w:proofErr w:type="spellStart"/>
-      <w:r>
-        <w:t>MsBuild</w:t>
-      </w:r>
-      <w:proofErr w:type="spellEnd"/>
-      <w:r>
-        <w:t xml:space="preserve"> folder are no longer used and have been deleted. </w:t>
+        <w:t xml:space="preserve">The XAML files in the Rules subfolder of the MsBuild folder are no longer used and have been deleted. </w:t>
       </w:r>
       <w:proofErr w:type="gramStart"/>
       <w:r>
@@ -2557,15 +1719,7 @@
       </w:r>
       <w:proofErr w:type="gramEnd"/>
       <w:r>
-        <w:t xml:space="preserve"> and .targets files to support SDK style projects and .Net 10. One of these changes automatically sets dependency relations between files, such as between </w:t>
-      </w:r>
-      <w:proofErr w:type="spellStart"/>
-      <w:r>
-        <w:t>VOBinary</w:t>
-      </w:r>
-      <w:proofErr w:type="spellEnd"/>
-      <w:r>
-        <w:t xml:space="preserve"> files and the module that they belong to.</w:t>
+        <w:t xml:space="preserve"> and .targets files to support SDK style projects and .Net 10. One of these changes automatically sets dependency relations between files, such as between VOBinary files and the module that they belong to.</w:t>
       </w:r>
     </w:p>
     <w:p>
@@ -2576,23 +1730,7 @@
         </w:numPr>
       </w:pPr>
       <w:r>
-        <w:t>The response file for the last build is now written to the intermediate output folder of the project with the name &lt;</w:t>
-      </w:r>
-      <w:proofErr w:type="spellStart"/>
-      <w:r>
-        <w:t>OutputFileName</w:t>
-      </w:r>
-      <w:proofErr w:type="spellEnd"/>
-      <w:r>
-        <w:t>&gt;.</w:t>
-      </w:r>
-      <w:proofErr w:type="spellStart"/>
-      <w:r>
-        <w:t>rsp</w:t>
-      </w:r>
-      <w:proofErr w:type="spellEnd"/>
-      <w:r>
-        <w:t xml:space="preserve">. A copy of this file is also written </w:t>
+        <w:t xml:space="preserve">The response file for the last build is now written to the intermediate output folder of the project with the name &lt;OutputFileName&gt;.rsp. A copy of this file is also written </w:t>
       </w:r>
       <w:proofErr w:type="gramStart"/>
       <w:r>
@@ -2600,15 +1738,7 @@
       </w:r>
       <w:proofErr w:type="gramEnd"/>
       <w:r>
-        <w:t xml:space="preserve"> the temp folder under the name </w:t>
-      </w:r>
-      <w:proofErr w:type="spellStart"/>
-      <w:r>
-        <w:t>LastXSharpResponseFile.Rsp</w:t>
-      </w:r>
-      <w:proofErr w:type="spellEnd"/>
-      <w:r>
-        <w:t xml:space="preserve"> </w:t>
+        <w:t xml:space="preserve"> the temp folder under the name LastXSharpResponseFile.Rsp </w:t>
       </w:r>
     </w:p>
     <w:p>
@@ -2633,15 +1763,7 @@
         </w:numPr>
       </w:pPr>
       <w:r>
-        <w:t xml:space="preserve">The Build task to compile native resources now checks the </w:t>
-      </w:r>
-      <w:proofErr w:type="spellStart"/>
-      <w:r>
-        <w:t>rc</w:t>
-      </w:r>
-      <w:proofErr w:type="spellEnd"/>
-      <w:r>
-        <w:t xml:space="preserve"> and </w:t>
+        <w:t xml:space="preserve">The Build task to compile native resources now checks the rc and </w:t>
       </w:r>
       <w:proofErr w:type="gramStart"/>
       <w:r>
@@ -2671,23 +1793,7 @@
         </w:numPr>
       </w:pPr>
       <w:r>
-        <w:t xml:space="preserve">For SDK projects File </w:t>
-      </w:r>
-      <w:proofErr w:type="spellStart"/>
-      <w:r>
-        <w:t>Foo.xh</w:t>
-      </w:r>
-      <w:proofErr w:type="spellEnd"/>
-      <w:r>
-        <w:t xml:space="preserve"> is now by default depending on </w:t>
-      </w:r>
-      <w:proofErr w:type="spellStart"/>
-      <w:r>
-        <w:t>Foo.prg</w:t>
-      </w:r>
-      <w:proofErr w:type="spellEnd"/>
-      <w:r>
-        <w:t xml:space="preserve"> when they both appear in the same folder</w:t>
+        <w:t>For SDK projects File Foo.xh is now by default depending on Foo.prg when they both appear in the same folder</w:t>
       </w:r>
     </w:p>
     <w:p>
@@ -2698,15 +1804,7 @@
         </w:numPr>
       </w:pPr>
       <w:r>
-        <w:t xml:space="preserve">Fixed an error reported by Stefan Hirsch, was caused by automatically adding an </w:t>
-      </w:r>
-      <w:proofErr w:type="spellStart"/>
-      <w:r>
-        <w:t>OSPlatformAttribute</w:t>
-      </w:r>
-      <w:proofErr w:type="spellEnd"/>
-      <w:r>
-        <w:t xml:space="preserve"> to the output assemblies</w:t>
+        <w:t>Fixed an error reported by Stefan Hirsch, was caused by automatically adding an OSPlatformAttribute to the output assemblies</w:t>
       </w:r>
     </w:p>
     <w:p>
@@ -2736,15 +1834,7 @@
         </w:numPr>
       </w:pPr>
       <w:r>
-        <w:t>Fixed an issue during build where an empty &lt;</w:t>
-      </w:r>
-      <w:proofErr w:type="spellStart"/>
-      <w:r>
-        <w:t>PrebuildEvent</w:t>
-      </w:r>
-      <w:proofErr w:type="spellEnd"/>
-      <w:r>
-        <w:t>&gt; that contains a CRLF could cause a build to fail.</w:t>
+        <w:t>Fixed an issue during build where an empty &lt;PrebuildEvent&gt; that contains a CRLF could cause a build to fail.</w:t>
       </w:r>
     </w:p>
     <w:p>
@@ -2774,12 +1864,15 @@
     </w:p>
     <w:p>
       <w:r>
-        <w:t xml:space="preserve">The new modifier tells the compiler to pass the variable by reference, which should make the code slightly faster. </w:t>
-      </w:r>
-    </w:p>
-    <w:p>
+        <w:t xml:space="preserve">The new modifier tells the compiler to pass the variable by reference, which should make the code </w:t>
+      </w:r>
       <w:r>
         <w:lastRenderedPageBreak/>
+        <w:t xml:space="preserve">slightly faster. </w:t>
+      </w:r>
+    </w:p>
+    <w:p>
+      <w:r>
         <w:t>It also tells the compiler that the parameter will not be changed by the code in the function / method</w:t>
       </w:r>
     </w:p>
@@ -2790,23 +1883,7 @@
     </w:p>
     <w:p>
       <w:r>
-        <w:t xml:space="preserve">X# 3 comes with runtime DLLs for both .net 46 and .net 8. Not all VOSDK </w:t>
-      </w:r>
-      <w:proofErr w:type="spellStart"/>
-      <w:r>
-        <w:t>Dlls</w:t>
-      </w:r>
-      <w:proofErr w:type="spellEnd"/>
-      <w:r>
-        <w:t xml:space="preserve"> have been ported to .Net 8 because they contain code that does not work in an </w:t>
-      </w:r>
-      <w:proofErr w:type="spellStart"/>
-      <w:r>
-        <w:t>AnyCPU</w:t>
-      </w:r>
-      <w:proofErr w:type="spellEnd"/>
-      <w:r>
-        <w:t xml:space="preserve"> environment.</w:t>
+        <w:t>X# 3 comes with runtime DLLs for both .net 46 and .net 8. Not all VOSDK Dlls have been ported to .Net 8 because they contain code that does not work in an AnyCPU environment.</w:t>
       </w:r>
     </w:p>
     <w:p>
@@ -2841,15 +1918,7 @@
         </w:numPr>
       </w:pPr>
       <w:r>
-        <w:t xml:space="preserve">The Runtime is now delivered in both DLL format as well as </w:t>
-      </w:r>
-      <w:proofErr w:type="spellStart"/>
-      <w:r>
-        <w:t>Nuget</w:t>
-      </w:r>
-      <w:proofErr w:type="spellEnd"/>
-      <w:r>
-        <w:t xml:space="preserve"> Packages. See the separate topic about the Runtime in this help file for a description of these packages and DLLs</w:t>
+        <w:t>The Runtime is now delivered in both DLL format as well as Nuget Packages. See the separate topic about the Runtime in this help file for a description of these packages and DLLs</w:t>
       </w:r>
     </w:p>
     <w:p>
@@ -2928,23 +1997,7 @@
         </w:numPr>
       </w:pPr>
       <w:r>
-        <w:t xml:space="preserve">Fixed potential issues with </w:t>
-      </w:r>
-      <w:proofErr w:type="spellStart"/>
-      <w:r>
-        <w:t>Null_date</w:t>
-      </w:r>
-      <w:proofErr w:type="spellEnd"/>
-      <w:r>
-        <w:t xml:space="preserve"> returned from </w:t>
-      </w:r>
-      <w:proofErr w:type="spellStart"/>
-      <w:r>
-        <w:t>OpenADS</w:t>
-      </w:r>
-      <w:proofErr w:type="spellEnd"/>
-      <w:r>
-        <w:t xml:space="preserve"> for the Last Update date in a DBF</w:t>
+        <w:t>Fixed potential issues with Null_date returned from OpenADS for the Last Update date in a DBF</w:t>
       </w:r>
     </w:p>
     <w:p>
@@ -2955,15 +2008,7 @@
         </w:numPr>
       </w:pPr>
       <w:r>
-        <w:t xml:space="preserve">Fixed an issue in the </w:t>
-      </w:r>
-      <w:proofErr w:type="spellStart"/>
-      <w:r>
-        <w:t>Macrocompiler</w:t>
-      </w:r>
-      <w:proofErr w:type="spellEnd"/>
-      <w:r>
-        <w:t xml:space="preserve"> for .Net 8</w:t>
+        <w:t>Fixed an issue in the Macrocompiler for .Net 8</w:t>
       </w:r>
     </w:p>
     <w:p>
@@ -2987,14 +2032,9 @@
       <w:r>
         <w:t xml:space="preserve">Fixed </w:t>
       </w:r>
-      <w:proofErr w:type="spellStart"/>
-      <w:proofErr w:type="gramStart"/>
-      <w:r>
-        <w:t>ADel</w:t>
-      </w:r>
-      <w:proofErr w:type="spellEnd"/>
-      <w:r>
-        <w:t>(</w:t>
+      <w:proofErr w:type="gramStart"/>
+      <w:r>
+        <w:t>ADel(</w:t>
       </w:r>
       <w:proofErr w:type="gramEnd"/>
       <w:r>
@@ -3047,15 +2087,7 @@
         </w:numPr>
       </w:pPr>
       <w:r>
-        <w:t xml:space="preserve">Added dummy stub implementations for Nation Functions in </w:t>
-      </w:r>
-      <w:proofErr w:type="spellStart"/>
-      <w:r>
-        <w:t>XSharp.VO</w:t>
-      </w:r>
-      <w:proofErr w:type="spellEnd"/>
-      <w:r>
-        <w:t xml:space="preserve"> (#1124)</w:t>
+        <w:t>Added dummy stub implementations for Nation Functions in XSharp.VO (#1124)</w:t>
       </w:r>
     </w:p>
     <w:p>
@@ -3066,15 +2098,7 @@
         </w:numPr>
       </w:pPr>
       <w:r>
-        <w:t xml:space="preserve">Fix a problem with the DBF cache when the same table is opened in 2 different </w:t>
-      </w:r>
-      <w:proofErr w:type="spellStart"/>
-      <w:r>
-        <w:t>workareas</w:t>
-      </w:r>
-      <w:proofErr w:type="spellEnd"/>
-      <w:r>
-        <w:t xml:space="preserve"> with a file name that only differs in case (#1828)</w:t>
+        <w:t>Fix a problem with the DBF cache when the same table is opened in 2 different workareas with a file name that only differs in case (#1828)</w:t>
       </w:r>
     </w:p>
     <w:p>
@@ -3085,15 +2109,7 @@
         </w:numPr>
       </w:pPr>
       <w:r>
-        <w:t xml:space="preserve">Fix a problem with the DBF Header locking for FoxPro tables with </w:t>
-      </w:r>
-      <w:proofErr w:type="spellStart"/>
-      <w:r>
-        <w:t>autonumber</w:t>
-      </w:r>
-      <w:proofErr w:type="spellEnd"/>
-      <w:r>
-        <w:t xml:space="preserve"> fields (#1829)</w:t>
+        <w:t>Fix a problem with the DBF Header locking for FoxPro tables with autonumber fields (#1829)</w:t>
       </w:r>
     </w:p>
     <w:p>
@@ -3104,15 +2120,7 @@
         </w:numPr>
       </w:pPr>
       <w:r>
-        <w:t xml:space="preserve">Fixed an issue in the </w:t>
-      </w:r>
-      <w:proofErr w:type="spellStart"/>
-      <w:r>
-        <w:t>Macrocompiler</w:t>
-      </w:r>
-      <w:proofErr w:type="spellEnd"/>
-      <w:r>
-        <w:t xml:space="preserve"> where fields and variables passed to a function with IN parameter would be updated.  (#1933)</w:t>
+        <w:t>Fixed an issue in the Macrocompiler where fields and variables passed to a function with IN parameter would be updated.  (#1933)</w:t>
       </w:r>
     </w:p>
     <w:p>
@@ -3133,27 +2141,17 @@
       <w:r>
         <w:t xml:space="preserve"> assigning to a hidden field or property was incorrectly allowed. Added </w:t>
       </w:r>
-      <w:proofErr w:type="spellStart"/>
-      <w:proofErr w:type="gramStart"/>
-      <w:r>
-        <w:t>NoIVarGetSelf</w:t>
-      </w:r>
-      <w:proofErr w:type="spellEnd"/>
-      <w:r>
-        <w:t>(</w:t>
+      <w:proofErr w:type="gramStart"/>
+      <w:r>
+        <w:t>NoIVarGetSelf(</w:t>
       </w:r>
       <w:proofErr w:type="gramEnd"/>
       <w:r>
         <w:t xml:space="preserve">) and </w:t>
       </w:r>
-      <w:proofErr w:type="spellStart"/>
-      <w:proofErr w:type="gramStart"/>
-      <w:r>
-        <w:t>NoIVarPutSelf</w:t>
-      </w:r>
-      <w:proofErr w:type="spellEnd"/>
-      <w:r>
-        <w:t>(</w:t>
+      <w:proofErr w:type="gramStart"/>
+      <w:r>
+        <w:t>NoIVarPutSelf(</w:t>
       </w:r>
       <w:proofErr w:type="gramEnd"/>
       <w:r>
@@ -3190,24 +2188,11 @@
         </w:numPr>
       </w:pPr>
       <w:r>
-        <w:t xml:space="preserve">Fix </w:t>
-      </w:r>
-      <w:proofErr w:type="spellStart"/>
-      <w:r>
-        <w:t>Dbc.FindTable</w:t>
-      </w:r>
-      <w:proofErr w:type="spellEnd"/>
-      <w:r>
-        <w:t xml:space="preserve"> to support Alias and/or </w:t>
-      </w:r>
-      <w:proofErr w:type="spellStart"/>
-      <w:proofErr w:type="gramStart"/>
-      <w:r>
-        <w:t>FileName</w:t>
-      </w:r>
-      <w:proofErr w:type="spellEnd"/>
-      <w:r>
-        <w:t xml:space="preserve">  (</w:t>
+        <w:t xml:space="preserve">Fix Dbc.FindTable to support Alias and/or </w:t>
+      </w:r>
+      <w:proofErr w:type="gramStart"/>
+      <w:r>
+        <w:t>FileName  (</w:t>
       </w:r>
       <w:proofErr w:type="gramEnd"/>
       <w:r>
@@ -3252,14 +2237,9 @@
       <w:r>
         <w:t xml:space="preserve">dded NLS_ defines and initial implementation for the </w:t>
       </w:r>
-      <w:proofErr w:type="spellStart"/>
-      <w:proofErr w:type="gramStart"/>
-      <w:r>
-        <w:t>SetLocale</w:t>
-      </w:r>
-      <w:proofErr w:type="spellEnd"/>
-      <w:r>
-        <w:t>(</w:t>
+      <w:proofErr w:type="gramStart"/>
+      <w:r>
+        <w:t>SetLocale(</w:t>
       </w:r>
       <w:proofErr w:type="gramEnd"/>
       <w:r>
@@ -3351,31 +2331,7 @@
         </w:numPr>
       </w:pPr>
       <w:r>
-        <w:t xml:space="preserve">The </w:t>
-      </w:r>
-      <w:proofErr w:type="spellStart"/>
-      <w:r>
-        <w:t>XSharp.VFP</w:t>
-      </w:r>
-      <w:proofErr w:type="spellEnd"/>
-      <w:r>
-        <w:t xml:space="preserve"> assembly now contains function definitions for all functions from VFP, even the ones that exist in </w:t>
-      </w:r>
-      <w:proofErr w:type="spellStart"/>
-      <w:r>
-        <w:t>XSharp.Core</w:t>
-      </w:r>
-      <w:proofErr w:type="spellEnd"/>
-      <w:r>
-        <w:t xml:space="preserve"> and </w:t>
-      </w:r>
-      <w:proofErr w:type="spellStart"/>
-      <w:r>
-        <w:t>XSharp.RT</w:t>
-      </w:r>
-      <w:proofErr w:type="spellEnd"/>
-      <w:r>
-        <w:t>. These functions will delegate the work to the implementation in the other assemblies.</w:t>
+        <w:t>The XSharp.VFP assembly now contains function definitions for all functions from VFP, even the ones that exist in XSharp.Core and XSharp.RT. These functions will delegate the work to the implementation in the other assemblies.</w:t>
       </w:r>
     </w:p>
     <w:p>
@@ -3386,16 +2342,12 @@
         </w:numPr>
       </w:pPr>
       <w:r>
+        <w:lastRenderedPageBreak/>
         <w:t xml:space="preserve">Added an implementation of the </w:t>
       </w:r>
-      <w:proofErr w:type="spellStart"/>
-      <w:proofErr w:type="gramStart"/>
-      <w:r>
-        <w:t>AUsed</w:t>
-      </w:r>
-      <w:proofErr w:type="spellEnd"/>
-      <w:r>
-        <w:t>(</w:t>
+      <w:proofErr w:type="gramStart"/>
+      <w:r>
+        <w:t>AUsed(</w:t>
       </w:r>
       <w:proofErr w:type="gramEnd"/>
       <w:r>
@@ -3410,49 +2362,19 @@
         </w:numPr>
       </w:pPr>
       <w:r>
-        <w:lastRenderedPageBreak/>
         <w:t xml:space="preserve">The implementation of several UI related functions, such as </w:t>
       </w:r>
-      <w:proofErr w:type="spellStart"/>
-      <w:proofErr w:type="gramStart"/>
-      <w:r>
-        <w:t>MessageBox</w:t>
-      </w:r>
-      <w:proofErr w:type="spellEnd"/>
-      <w:r>
-        <w:t>(</w:t>
-      </w:r>
-      <w:proofErr w:type="gramEnd"/>
-      <w:r>
-        <w:t xml:space="preserve">), have been moved from </w:t>
-      </w:r>
-      <w:proofErr w:type="spellStart"/>
-      <w:r>
-        <w:t>XSharp.VFP</w:t>
-      </w:r>
-      <w:proofErr w:type="spellEnd"/>
-      <w:r>
-        <w:t xml:space="preserve"> to </w:t>
-      </w:r>
-      <w:proofErr w:type="spellStart"/>
-      <w:r>
-        <w:t>XSharp.VFP.UI</w:t>
-      </w:r>
-      <w:proofErr w:type="spellEnd"/>
-      <w:r>
-        <w:t>.</w:t>
+      <w:proofErr w:type="gramStart"/>
+      <w:r>
+        <w:t>MessageBox(</w:t>
+      </w:r>
+      <w:proofErr w:type="gramEnd"/>
+      <w:r>
+        <w:t>), have been moved from XSharp.VFP to XSharp.VFP.UI.</w:t>
       </w:r>
       <w:r>
         <w:br/>
-        <w:t xml:space="preserve">These functions will now output to the console window when </w:t>
-      </w:r>
-      <w:proofErr w:type="spellStart"/>
-      <w:r>
-        <w:t>XSharp.VFP.UI</w:t>
-      </w:r>
-      <w:proofErr w:type="spellEnd"/>
-      <w:r>
-        <w:t xml:space="preserve"> cannot be found.</w:t>
+        <w:t>These functions will now output to the console window when XSharp.VFP.UI cannot be found.</w:t>
       </w:r>
     </w:p>
     <w:p>
@@ -3463,50 +2385,27 @@
         </w:numPr>
       </w:pPr>
       <w:r>
-        <w:t>Added [</w:t>
-      </w:r>
-      <w:proofErr w:type="spellStart"/>
-      <w:r>
-        <w:t>FoxArrayInputParameterAttribute</w:t>
-      </w:r>
-      <w:proofErr w:type="spellEnd"/>
-      <w:r>
-        <w:t xml:space="preserve">] and an array result stack to support functions such as </w:t>
-      </w:r>
-      <w:proofErr w:type="spellStart"/>
-      <w:proofErr w:type="gramStart"/>
-      <w:r>
-        <w:t>AMembers</w:t>
-      </w:r>
-      <w:proofErr w:type="spellEnd"/>
-      <w:r>
-        <w:t>(</w:t>
+        <w:t xml:space="preserve">Added [FoxArrayInputParameterAttribute] and an array result stack to support functions such as </w:t>
+      </w:r>
+      <w:proofErr w:type="gramStart"/>
+      <w:r>
+        <w:t>AMembers(</w:t>
       </w:r>
       <w:proofErr w:type="gramEnd"/>
       <w:r>
         <w:t xml:space="preserve">), </w:t>
       </w:r>
-      <w:proofErr w:type="spellStart"/>
-      <w:proofErr w:type="gramStart"/>
-      <w:r>
-        <w:t>APrinters</w:t>
-      </w:r>
-      <w:proofErr w:type="spellEnd"/>
-      <w:r>
-        <w:t>(</w:t>
+      <w:proofErr w:type="gramStart"/>
+      <w:r>
+        <w:t>APrinters(</w:t>
       </w:r>
       <w:proofErr w:type="gramEnd"/>
       <w:r>
         <w:t xml:space="preserve">) and </w:t>
       </w:r>
-      <w:proofErr w:type="spellStart"/>
-      <w:proofErr w:type="gramStart"/>
-      <w:r>
-        <w:t>AUsed</w:t>
-      </w:r>
-      <w:proofErr w:type="spellEnd"/>
-      <w:r>
-        <w:t>(</w:t>
+      <w:proofErr w:type="gramStart"/>
+      <w:r>
+        <w:t>AUsed(</w:t>
       </w:r>
       <w:proofErr w:type="gramEnd"/>
       <w:r>
@@ -3523,27 +2422,17 @@
       <w:r>
         <w:t xml:space="preserve">Adjusted </w:t>
       </w:r>
-      <w:proofErr w:type="spellStart"/>
-      <w:proofErr w:type="gramStart"/>
-      <w:r>
-        <w:t>AMembers</w:t>
-      </w:r>
-      <w:proofErr w:type="spellEnd"/>
-      <w:r>
-        <w:t>(</w:t>
+      <w:proofErr w:type="gramStart"/>
+      <w:r>
+        <w:t>AMembers(</w:t>
       </w:r>
       <w:proofErr w:type="gramEnd"/>
       <w:r>
         <w:t xml:space="preserve">) and </w:t>
       </w:r>
-      <w:proofErr w:type="spellStart"/>
-      <w:proofErr w:type="gramStart"/>
-      <w:r>
-        <w:t>APrinters</w:t>
-      </w:r>
-      <w:proofErr w:type="spellEnd"/>
-      <w:r>
-        <w:t>(</w:t>
+      <w:proofErr w:type="gramStart"/>
+      <w:r>
+        <w:t>APrinters(</w:t>
       </w:r>
       <w:proofErr w:type="gramEnd"/>
       <w:r>
@@ -3558,15 +2447,80 @@
         </w:numPr>
       </w:pPr>
       <w:r>
+        <w:t>Fixed Set.Compatible default return value: it was incorrectly returning string "OFF" instead of LOGIC FALSE</w:t>
+      </w:r>
+    </w:p>
+    <w:p>
+      <w:pPr>
+        <w:numPr>
+          <w:ilvl w:val="0"/>
+          <w:numId w:val="9"/>
+        </w:numPr>
+      </w:pPr>
+      <w:r>
+        <w:t xml:space="preserve">Added Set.Compatible handler in the </w:t>
+      </w:r>
+      <w:proofErr w:type="gramStart"/>
+      <w:r>
+        <w:t>Set(</w:t>
+      </w:r>
+      <w:proofErr w:type="gramEnd"/>
+      <w:r>
+        <w:t>) function, supporting both string values ("ON", "OFF", "DB4") and LOGIC values</w:t>
+      </w:r>
+    </w:p>
+    <w:p>
+      <w:pPr>
+        <w:numPr>
+          <w:ilvl w:val="0"/>
+          <w:numId w:val="9"/>
+        </w:numPr>
+      </w:pPr>
+      <w:r>
+        <w:t xml:space="preserve">The DBFVFP driver now allows index expressions that contain </w:t>
+      </w:r>
+      <w:proofErr w:type="gramStart"/>
+      <w:r>
+        <w:t>Trim(</w:t>
+      </w:r>
+      <w:proofErr w:type="gramEnd"/>
+      <w:r>
+        <w:t xml:space="preserve">), </w:t>
+      </w:r>
+      <w:proofErr w:type="gramStart"/>
+      <w:r>
+        <w:t>Ltrim(</w:t>
+      </w:r>
+      <w:proofErr w:type="gramEnd"/>
+      <w:r>
+        <w:t xml:space="preserve">), </w:t>
+      </w:r>
+      <w:proofErr w:type="gramStart"/>
+      <w:r>
+        <w:t>RTrim(</w:t>
+      </w:r>
+      <w:proofErr w:type="gramEnd"/>
+      <w:r>
+        <w:t>) etc. (#1837)</w:t>
+      </w:r>
+    </w:p>
+    <w:p>
+      <w:pPr>
+        <w:numPr>
+          <w:ilvl w:val="0"/>
+          <w:numId w:val="9"/>
+        </w:numPr>
+      </w:pPr>
+      <w:r>
         <w:t xml:space="preserve">Fixed </w:t>
       </w:r>
-      <w:proofErr w:type="spellStart"/>
-      <w:r>
-        <w:t>Set.Compatible</w:t>
-      </w:r>
-      <w:proofErr w:type="spellEnd"/>
-      <w:r>
-        <w:t xml:space="preserve"> default return value: it was incorrectly returning string "OFF" instead of LOGIC FALSE</w:t>
+      <w:proofErr w:type="gramStart"/>
+      <w:r>
+        <w:t>FDate(</w:t>
+      </w:r>
+      <w:proofErr w:type="gramEnd"/>
+      <w:r>
+        <w:t>) to accept a filename parameter and return the actual last-write date of the file (#1856)</w:t>
       </w:r>
     </w:p>
     <w:p>
@@ -3577,23 +2531,15 @@
         </w:numPr>
       </w:pPr>
       <w:r>
-        <w:t xml:space="preserve">Added </w:t>
-      </w:r>
-      <w:proofErr w:type="spellStart"/>
-      <w:r>
-        <w:t>Set.Compatible</w:t>
-      </w:r>
-      <w:proofErr w:type="spellEnd"/>
-      <w:r>
-        <w:t xml:space="preserve"> handler in the </w:t>
-      </w:r>
-      <w:proofErr w:type="gramStart"/>
-      <w:r>
-        <w:t>Set(</w:t>
-      </w:r>
-      <w:proofErr w:type="gramEnd"/>
-      <w:r>
-        <w:t>) function, supporting both string values ("ON", "OFF", "DB4") and LOGIC values</w:t>
+        <w:t xml:space="preserve">Fixed </w:t>
+      </w:r>
+      <w:proofErr w:type="gramStart"/>
+      <w:r>
+        <w:t>FTime(</w:t>
+      </w:r>
+      <w:proofErr w:type="gramEnd"/>
+      <w:r>
+        <w:t>) to accept a filename parameter and return the actual last-write time of the file (#1856)</w:t>
       </w:r>
     </w:p>
     <w:p>
@@ -3604,41 +2550,197 @@
         </w:numPr>
       </w:pPr>
       <w:r>
-        <w:t xml:space="preserve">The DBFVFP driver now allows index expressions that contain </w:t>
-      </w:r>
-      <w:proofErr w:type="gramStart"/>
-      <w:r>
-        <w:t>Trim(</w:t>
+        <w:t xml:space="preserve">Fixed </w:t>
+      </w:r>
+      <w:proofErr w:type="gramStart"/>
+      <w:r>
+        <w:t>FSize(</w:t>
+      </w:r>
+      <w:proofErr w:type="gramEnd"/>
+      <w:r>
+        <w:t>) VFP compatibility: when SET COMPATIBLE is ON and no work area is specified, it returns the size of the named file; when the filename has no extension, a .DBF extension is assumed (#1856)</w:t>
+      </w:r>
+    </w:p>
+    <w:p>
+      <w:pPr>
+        <w:numPr>
+          <w:ilvl w:val="0"/>
+          <w:numId w:val="9"/>
+        </w:numPr>
+      </w:pPr>
+      <w:r>
+        <w:t xml:space="preserve">Added new file functions </w:t>
+      </w:r>
+      <w:proofErr w:type="gramStart"/>
+      <w:r>
+        <w:t>FName(</w:t>
+      </w:r>
+      <w:proofErr w:type="gramEnd"/>
+      <w:r>
+        <w:t xml:space="preserve">) (returns the filename from a path) and </w:t>
+      </w:r>
+      <w:proofErr w:type="gramStart"/>
+      <w:r>
+        <w:t>FAttrib(</w:t>
+      </w:r>
+      <w:proofErr w:type="gramEnd"/>
+      <w:r>
+        <w:t>) (returns file attributes) (#1856)</w:t>
+      </w:r>
+    </w:p>
+    <w:p>
+      <w:pPr>
+        <w:numPr>
+          <w:ilvl w:val="0"/>
+          <w:numId w:val="9"/>
+        </w:numPr>
+      </w:pPr>
+      <w:r>
+        <w:t>Fixed COPY TO ARRAY (#1857)</w:t>
+      </w:r>
+    </w:p>
+    <w:p>
+      <w:pPr>
+        <w:numPr>
+          <w:ilvl w:val="0"/>
+          <w:numId w:val="9"/>
+        </w:numPr>
+      </w:pPr>
+      <w:r>
+        <w:t>Added the [NeedsAccessToLocals] attribute to VFP Macro Wrapper functions to preserve correct macro evaluation behavior (#1858)</w:t>
+      </w:r>
+    </w:p>
+    <w:p>
+      <w:pPr>
+        <w:numPr>
+          <w:ilvl w:val="0"/>
+          <w:numId w:val="9"/>
+        </w:numPr>
+      </w:pPr>
+      <w:r>
+        <w:t>Added SET POINT and SET SEPARATOR support (#1867, #1883)</w:t>
+      </w:r>
+    </w:p>
+    <w:p>
+      <w:pPr>
+        <w:numPr>
+          <w:ilvl w:val="0"/>
+          <w:numId w:val="9"/>
+        </w:numPr>
+      </w:pPr>
+      <w:r>
+        <w:t>Fixed RELEASE ALL LIKE when a quoted pattern is used in the skeleton (#1870)</w:t>
+      </w:r>
+    </w:p>
+    <w:p>
+      <w:pPr>
+        <w:numPr>
+          <w:ilvl w:val="0"/>
+          <w:numId w:val="9"/>
+        </w:numPr>
+      </w:pPr>
+      <w:r>
+        <w:t>Added support for the SET BELL TO command (the command is accepted and ignored, matching VFP behavior) (#1874)</w:t>
+      </w:r>
+    </w:p>
+    <w:p>
+      <w:pPr>
+        <w:numPr>
+          <w:ilvl w:val="0"/>
+          <w:numId w:val="9"/>
+        </w:numPr>
+      </w:pPr>
+      <w:r>
+        <w:t xml:space="preserve">Implemented </w:t>
+      </w:r>
+      <w:proofErr w:type="gramStart"/>
+      <w:r>
+        <w:t>NORMALIZE(</w:t>
+      </w:r>
+      <w:proofErr w:type="gramEnd"/>
+      <w:r>
+        <w:t xml:space="preserve">) and </w:t>
+      </w:r>
+      <w:proofErr w:type="gramStart"/>
+      <w:r>
+        <w:t>DISPLAYPATH(</w:t>
+      </w:r>
+      <w:proofErr w:type="gramEnd"/>
+      <w:r>
+        <w:t>) functions (#1880)</w:t>
+      </w:r>
+    </w:p>
+    <w:p>
+      <w:pPr>
+        <w:numPr>
+          <w:ilvl w:val="0"/>
+          <w:numId w:val="9"/>
+        </w:numPr>
+      </w:pPr>
+      <w:r>
+        <w:t xml:space="preserve">Fixed </w:t>
+      </w:r>
+      <w:proofErr w:type="gramStart"/>
+      <w:r>
+        <w:t>VARTYPE(</w:t>
+      </w:r>
+      <w:proofErr w:type="gramEnd"/>
+      <w:r>
+        <w:t>) throwing exceptions for undeclared variables (#1882)</w:t>
+      </w:r>
+    </w:p>
+    <w:p>
+      <w:pPr>
+        <w:numPr>
+          <w:ilvl w:val="0"/>
+          <w:numId w:val="9"/>
+        </w:numPr>
+      </w:pPr>
+      <w:r>
+        <w:t>Fixed SET DEFAULT TO command paths and working directory handling (#1884)</w:t>
+      </w:r>
+    </w:p>
+    <w:p>
+      <w:pPr>
+        <w:numPr>
+          <w:ilvl w:val="0"/>
+          <w:numId w:val="9"/>
+        </w:numPr>
+      </w:pPr>
+      <w:r>
+        <w:t xml:space="preserve">Implemented </w:t>
+      </w:r>
+      <w:proofErr w:type="gramStart"/>
+      <w:r>
+        <w:t>Lock(</w:t>
       </w:r>
       <w:proofErr w:type="gramEnd"/>
       <w:r>
         <w:t xml:space="preserve">), </w:t>
       </w:r>
-      <w:proofErr w:type="spellStart"/>
-      <w:proofErr w:type="gramStart"/>
-      <w:r>
-        <w:t>Ltrim</w:t>
-      </w:r>
-      <w:proofErr w:type="spellEnd"/>
-      <w:r>
-        <w:t>(</w:t>
+      <w:proofErr w:type="gramStart"/>
+      <w:r>
+        <w:t>RLock(</w:t>
       </w:r>
       <w:proofErr w:type="gramEnd"/>
       <w:r>
         <w:t xml:space="preserve">), </w:t>
       </w:r>
-      <w:proofErr w:type="spellStart"/>
-      <w:proofErr w:type="gramStart"/>
-      <w:r>
-        <w:t>RTrim</w:t>
-      </w:r>
-      <w:proofErr w:type="spellEnd"/>
-      <w:r>
-        <w:t>(</w:t>
-      </w:r>
-      <w:proofErr w:type="gramEnd"/>
-      <w:r>
-        <w:t>) etc. (#1837)</w:t>
+      <w:proofErr w:type="gramStart"/>
+      <w:r>
+        <w:t>FLock(</w:t>
+      </w:r>
+      <w:proofErr w:type="gramEnd"/>
+      <w:r>
+        <w:t xml:space="preserve">) and </w:t>
+      </w:r>
+      <w:proofErr w:type="gramStart"/>
+      <w:r>
+        <w:t>UnLock(</w:t>
+      </w:r>
+      <w:proofErr w:type="gramEnd"/>
+      <w:r>
+        <w:t>) for SQLRDD (#1885)</w:t>
       </w:r>
     </w:p>
     <w:p>
@@ -3649,20 +2751,105 @@
         </w:numPr>
       </w:pPr>
       <w:r>
+        <w:t>VFP GUI provider now loads dynamically via AssemblyHelper (#1888)</w:t>
+      </w:r>
+    </w:p>
+    <w:p>
+      <w:pPr>
+        <w:numPr>
+          <w:ilvl w:val="0"/>
+          <w:numId w:val="9"/>
+        </w:numPr>
+      </w:pPr>
+      <w:r>
+        <w:t>Fixed RELEASE ALL LIKE when quoted patterns are passed in the skeleton (#1889)</w:t>
+      </w:r>
+    </w:p>
+    <w:p>
+      <w:pPr>
+        <w:numPr>
+          <w:ilvl w:val="0"/>
+          <w:numId w:val="9"/>
+        </w:numPr>
+      </w:pPr>
+      <w:r>
+        <w:t>Added missing parameterless and IntPtr overloads for F* file functions (#1890)</w:t>
+      </w:r>
+    </w:p>
+    <w:p>
+      <w:pPr>
+        <w:numPr>
+          <w:ilvl w:val="0"/>
+          <w:numId w:val="9"/>
+        </w:numPr>
+      </w:pPr>
+      <w:r>
+        <w:t>Fixed SET MEMOWIDTH, SYSMETRIC and COPY TO ARRAY (#1891)</w:t>
+      </w:r>
+    </w:p>
+    <w:p>
+      <w:pPr>
+        <w:numPr>
+          <w:ilvl w:val="0"/>
+          <w:numId w:val="9"/>
+        </w:numPr>
+      </w:pPr>
+      <w:r>
+        <w:t>Refined SET('DEFAULT') and SET('DIRECTORY') (#1892)</w:t>
+      </w:r>
+    </w:p>
+    <w:p>
+      <w:pPr>
+        <w:numPr>
+          <w:ilvl w:val="0"/>
+          <w:numId w:val="9"/>
+        </w:numPr>
+      </w:pPr>
+      <w:r>
+        <w:t xml:space="preserve">Implemented </w:t>
+      </w:r>
+      <w:proofErr w:type="gramStart"/>
+      <w:r>
+        <w:t>FCHSIZE(</w:t>
+      </w:r>
+      <w:proofErr w:type="gramEnd"/>
+      <w:r>
+        <w:t xml:space="preserve">) and VFP-compatible </w:t>
+      </w:r>
+      <w:proofErr w:type="gramStart"/>
+      <w:r>
+        <w:t>BINTOC(</w:t>
+      </w:r>
+      <w:proofErr w:type="gramEnd"/>
+      <w:r>
+        <w:t xml:space="preserve">) / </w:t>
+      </w:r>
+      <w:proofErr w:type="gramStart"/>
+      <w:r>
+        <w:t>CTOBIN(</w:t>
+      </w:r>
+      <w:proofErr w:type="gramEnd"/>
+      <w:r>
+        <w:t>) (#1893)</w:t>
+      </w:r>
+    </w:p>
+    <w:p>
+      <w:pPr>
+        <w:numPr>
+          <w:ilvl w:val="0"/>
+          <w:numId w:val="9"/>
+        </w:numPr>
+      </w:pPr>
+      <w:r>
         <w:t xml:space="preserve">Fixed </w:t>
       </w:r>
-      <w:proofErr w:type="spellStart"/>
-      <w:proofErr w:type="gramStart"/>
-      <w:r>
-        <w:t>FDate</w:t>
-      </w:r>
-      <w:proofErr w:type="spellEnd"/>
-      <w:r>
-        <w:t>(</w:t>
-      </w:r>
-      <w:proofErr w:type="gramEnd"/>
-      <w:r>
-        <w:t>) to accept a filename parameter and return the actual last-write date of the file (#1856)</w:t>
+      <w:proofErr w:type="gramStart"/>
+      <w:r>
+        <w:t>SYSMETRIC(</w:t>
+      </w:r>
+      <w:proofErr w:type="gramEnd"/>
+      <w:r>
+        <w:t>) calls, SET MEMOWIDTH typo, and SET DEFAULT/DIRECTORY initialization issues at startup (#1894)</w:t>
       </w:r>
     </w:p>
     <w:p>
@@ -3673,20 +2860,61 @@
         </w:numPr>
       </w:pPr>
       <w:r>
+        <w:t>Fixed MemoHelpers.MAX_WIDTH to be a dynamic property (#1895)</w:t>
+      </w:r>
+    </w:p>
+    <w:p>
+      <w:pPr>
+        <w:numPr>
+          <w:ilvl w:val="0"/>
+          <w:numId w:val="9"/>
+        </w:numPr>
+      </w:pPr>
+      <w:r>
+        <w:t xml:space="preserve">Implemented </w:t>
+      </w:r>
+      <w:proofErr w:type="gramStart"/>
+      <w:r>
+        <w:t>GETDIR(</w:t>
+      </w:r>
+      <w:proofErr w:type="gramEnd"/>
+      <w:r>
+        <w:t xml:space="preserve">), </w:t>
+      </w:r>
+      <w:proofErr w:type="gramStart"/>
+      <w:r>
+        <w:t>GETFILE(</w:t>
+      </w:r>
+      <w:proofErr w:type="gramEnd"/>
+      <w:r>
+        <w:t xml:space="preserve">) and </w:t>
+      </w:r>
+      <w:proofErr w:type="gramStart"/>
+      <w:r>
+        <w:t>GETPICT(</w:t>
+      </w:r>
+      <w:proofErr w:type="gramEnd"/>
+      <w:r>
+        <w:t>) dialog functions (#1896)</w:t>
+      </w:r>
+    </w:p>
+    <w:p>
+      <w:pPr>
+        <w:numPr>
+          <w:ilvl w:val="0"/>
+          <w:numId w:val="9"/>
+        </w:numPr>
+      </w:pPr>
+      <w:r>
         <w:t xml:space="preserve">Fixed </w:t>
       </w:r>
-      <w:proofErr w:type="spellStart"/>
-      <w:proofErr w:type="gramStart"/>
-      <w:r>
-        <w:t>FTime</w:t>
-      </w:r>
-      <w:proofErr w:type="spellEnd"/>
-      <w:r>
-        <w:t>(</w:t>
-      </w:r>
-      <w:proofErr w:type="gramEnd"/>
-      <w:r>
-        <w:t>) to accept a filename parameter and return the actual last-write time of the file (#1856)</w:t>
+      <w:proofErr w:type="gramStart"/>
+      <w:r>
+        <w:t>MESSAGEBOX(</w:t>
+      </w:r>
+      <w:proofErr w:type="gramEnd"/>
+      <w:r>
+        <w:t>) timeout issue and implemented dynamic parameter handling (#1897)</w:t>
       </w:r>
     </w:p>
     <w:p>
@@ -3697,20 +2925,7 @@
         </w:numPr>
       </w:pPr>
       <w:r>
-        <w:t xml:space="preserve">Fixed </w:t>
-      </w:r>
-      <w:proofErr w:type="spellStart"/>
-      <w:proofErr w:type="gramStart"/>
-      <w:r>
-        <w:t>FSize</w:t>
-      </w:r>
-      <w:proofErr w:type="spellEnd"/>
-      <w:r>
-        <w:t>(</w:t>
-      </w:r>
-      <w:proofErr w:type="gramEnd"/>
-      <w:r>
-        <w:t>) VFP compatibility: when SET COMPATIBLE is ON and no work area is specified, it returns the size of the named file; when the filename has no extension, a .DBF extension is assumed (#1856)</w:t>
+        <w:t>Implemented DIR/DIRECTORY command with output parity to VFP (#1900)</w:t>
       </w:r>
     </w:p>
     <w:p>
@@ -3721,28 +2936,7 @@
         </w:numPr>
       </w:pPr>
       <w:r>
-        <w:t xml:space="preserve">Added new file functions </w:t>
-      </w:r>
-      <w:proofErr w:type="gramStart"/>
-      <w:r>
-        <w:t>FName(</w:t>
-      </w:r>
-      <w:proofErr w:type="gramEnd"/>
-      <w:r>
-        <w:t xml:space="preserve">) (returns the filename from a path) and </w:t>
-      </w:r>
-      <w:proofErr w:type="spellStart"/>
-      <w:proofErr w:type="gramStart"/>
-      <w:r>
-        <w:t>FAttrib</w:t>
-      </w:r>
-      <w:proofErr w:type="spellEnd"/>
-      <w:r>
-        <w:t>(</w:t>
-      </w:r>
-      <w:proofErr w:type="gramEnd"/>
-      <w:r>
-        <w:t>) (returns file attributes) (#1856)</w:t>
+        <w:t>Implemented SET DEVICE TO FILE redirection (#1901)</w:t>
       </w:r>
     </w:p>
     <w:p>
@@ -3753,7 +2947,23 @@
         </w:numPr>
       </w:pPr>
       <w:r>
-        <w:t>Fixed COPY TO ARRAY (#1857)</w:t>
+        <w:t xml:space="preserve">Implemented </w:t>
+      </w:r>
+      <w:proofErr w:type="gramStart"/>
+      <w:r>
+        <w:t>ISPEN(</w:t>
+      </w:r>
+      <w:proofErr w:type="gramEnd"/>
+      <w:r>
+        <w:t xml:space="preserve">) (returns FALSE — no Tablet support) and </w:t>
+      </w:r>
+      <w:proofErr w:type="gramStart"/>
+      <w:r>
+        <w:t>IMESTATUS(</w:t>
+      </w:r>
+      <w:proofErr w:type="gramEnd"/>
+      <w:r>
+        <w:t>) (returns 0 — no IME support) (#1924)</w:t>
       </w:r>
     </w:p>
     <w:p>
@@ -3764,63 +2974,11 @@
         </w:numPr>
       </w:pPr>
       <w:r>
-        <w:t>Added the [</w:t>
-      </w:r>
-      <w:proofErr w:type="spellStart"/>
-      <w:r>
-        <w:t>NeedsAccessToLocals</w:t>
-      </w:r>
-      <w:proofErr w:type="spellEnd"/>
-      <w:r>
-        <w:t>] attribute to VFP Macro Wrapper functions to preserve correct macro evaluation behavior (#1858)</w:t>
-      </w:r>
-    </w:p>
-    <w:p>
-      <w:pPr>
-        <w:numPr>
-          <w:ilvl w:val="0"/>
-          <w:numId w:val="9"/>
-        </w:numPr>
-      </w:pPr>
-      <w:r>
-        <w:t>Added SET POINT and SET SEPARATOR support (#1867, #1883)</w:t>
-      </w:r>
-    </w:p>
-    <w:p>
-      <w:pPr>
-        <w:numPr>
-          <w:ilvl w:val="0"/>
-          <w:numId w:val="9"/>
-        </w:numPr>
-      </w:pPr>
-      <w:r>
-        <w:t>Fixed RELEASE ALL LIKE when a quoted pattern is used in the skeleton (#1870)</w:t>
-      </w:r>
-    </w:p>
-    <w:p>
-      <w:pPr>
-        <w:numPr>
-          <w:ilvl w:val="0"/>
-          <w:numId w:val="9"/>
-        </w:numPr>
-      </w:pPr>
-      <w:r>
-        <w:t>Added support for the SET BELL TO command (the command is accepted and ignored, matching VFP behavior) (#1874)</w:t>
-      </w:r>
-    </w:p>
-    <w:p>
-      <w:pPr>
-        <w:numPr>
-          <w:ilvl w:val="0"/>
-          <w:numId w:val="9"/>
-        </w:numPr>
-      </w:pPr>
-      <w:r>
         <w:t xml:space="preserve">Implemented </w:t>
       </w:r>
       <w:proofErr w:type="gramStart"/>
       <w:r>
-        <w:t>NORMALIZE(</w:t>
+        <w:t>PROW(</w:t>
       </w:r>
       <w:proofErr w:type="gramEnd"/>
       <w:r>
@@ -3828,400 +2986,11 @@
       </w:r>
       <w:proofErr w:type="gramStart"/>
       <w:r>
-        <w:t>DISPLAYPATH(</w:t>
-      </w:r>
-      <w:proofErr w:type="gramEnd"/>
-      <w:r>
-        <w:t>) functions (#1880)</w:t>
-      </w:r>
-    </w:p>
-    <w:p>
-      <w:pPr>
-        <w:numPr>
-          <w:ilvl w:val="0"/>
-          <w:numId w:val="9"/>
-        </w:numPr>
-      </w:pPr>
-      <w:r>
-        <w:t xml:space="preserve">Fixed </w:t>
-      </w:r>
-      <w:proofErr w:type="gramStart"/>
-      <w:r>
-        <w:t>VARTYPE(</w:t>
-      </w:r>
-      <w:proofErr w:type="gramEnd"/>
-      <w:r>
-        <w:t>) throwing exceptions for undeclared variables (#1882)</w:t>
-      </w:r>
-    </w:p>
-    <w:p>
-      <w:pPr>
-        <w:numPr>
-          <w:ilvl w:val="0"/>
-          <w:numId w:val="9"/>
-        </w:numPr>
-      </w:pPr>
-      <w:r>
-        <w:t>Fixed SET DEFAULT TO command paths and working directory handling (#1884)</w:t>
-      </w:r>
-    </w:p>
-    <w:p>
-      <w:pPr>
-        <w:numPr>
-          <w:ilvl w:val="0"/>
-          <w:numId w:val="9"/>
-        </w:numPr>
-      </w:pPr>
-      <w:r>
-        <w:t xml:space="preserve">Implemented </w:t>
-      </w:r>
-      <w:proofErr w:type="gramStart"/>
-      <w:r>
-        <w:t>Lock(</w:t>
-      </w:r>
-      <w:proofErr w:type="gramEnd"/>
-      <w:r>
-        <w:t xml:space="preserve">), </w:t>
-      </w:r>
-      <w:proofErr w:type="spellStart"/>
-      <w:proofErr w:type="gramStart"/>
-      <w:r>
-        <w:t>RLock</w:t>
-      </w:r>
-      <w:proofErr w:type="spellEnd"/>
-      <w:r>
-        <w:t>(</w:t>
-      </w:r>
-      <w:proofErr w:type="gramEnd"/>
-      <w:r>
-        <w:t xml:space="preserve">), </w:t>
-      </w:r>
-      <w:proofErr w:type="spellStart"/>
-      <w:proofErr w:type="gramStart"/>
-      <w:r>
-        <w:t>FLock</w:t>
-      </w:r>
-      <w:proofErr w:type="spellEnd"/>
-      <w:r>
-        <w:t>(</w:t>
-      </w:r>
-      <w:proofErr w:type="gramEnd"/>
-      <w:r>
-        <w:t xml:space="preserve">) and </w:t>
-      </w:r>
-      <w:proofErr w:type="spellStart"/>
-      <w:proofErr w:type="gramStart"/>
-      <w:r>
-        <w:t>UnLock</w:t>
-      </w:r>
-      <w:proofErr w:type="spellEnd"/>
-      <w:r>
-        <w:t>(</w:t>
-      </w:r>
-      <w:proofErr w:type="gramEnd"/>
-      <w:r>
-        <w:t>) for SQLRDD (#1885)</w:t>
-      </w:r>
-    </w:p>
-    <w:p>
-      <w:pPr>
-        <w:numPr>
-          <w:ilvl w:val="0"/>
-          <w:numId w:val="9"/>
-        </w:numPr>
-      </w:pPr>
-      <w:r>
-        <w:t xml:space="preserve">VFP GUI provider now loads dynamically via </w:t>
-      </w:r>
-      <w:proofErr w:type="spellStart"/>
-      <w:r>
-        <w:t>AssemblyHelper</w:t>
-      </w:r>
-      <w:proofErr w:type="spellEnd"/>
-      <w:r>
-        <w:t xml:space="preserve"> (#1888)</w:t>
-      </w:r>
-    </w:p>
-    <w:p>
-      <w:pPr>
-        <w:numPr>
-          <w:ilvl w:val="0"/>
-          <w:numId w:val="9"/>
-        </w:numPr>
-      </w:pPr>
-      <w:r>
-        <w:t>Fixed RELEASE ALL LIKE when quoted patterns are passed in the skeleton (#1889)</w:t>
-      </w:r>
-    </w:p>
-    <w:p>
-      <w:pPr>
-        <w:numPr>
-          <w:ilvl w:val="0"/>
-          <w:numId w:val="9"/>
-        </w:numPr>
-      </w:pPr>
-      <w:r>
-        <w:t xml:space="preserve">Added missing </w:t>
-      </w:r>
-      <w:proofErr w:type="spellStart"/>
-      <w:r>
-        <w:t>parameterless</w:t>
-      </w:r>
-      <w:proofErr w:type="spellEnd"/>
-      <w:r>
-        <w:t xml:space="preserve"> and </w:t>
-      </w:r>
-      <w:proofErr w:type="spellStart"/>
-      <w:r>
-        <w:t>IntPtr</w:t>
-      </w:r>
-      <w:proofErr w:type="spellEnd"/>
-      <w:r>
-        <w:t xml:space="preserve"> overloads for F* file functions (#1890)</w:t>
-      </w:r>
-    </w:p>
-    <w:p>
-      <w:pPr>
-        <w:numPr>
-          <w:ilvl w:val="0"/>
-          <w:numId w:val="9"/>
-        </w:numPr>
-      </w:pPr>
-      <w:r>
-        <w:t>Fixed SET MEMOWIDTH, SYSMETRIC and COPY TO ARRAY (#1891)</w:t>
-      </w:r>
-    </w:p>
-    <w:p>
-      <w:pPr>
-        <w:numPr>
-          <w:ilvl w:val="0"/>
-          <w:numId w:val="9"/>
-        </w:numPr>
-      </w:pPr>
-      <w:r>
-        <w:t>Refined SET('DEFAULT') and SET('DIRECTORY') (#1892)</w:t>
-      </w:r>
-    </w:p>
-    <w:p>
-      <w:pPr>
-        <w:numPr>
-          <w:ilvl w:val="0"/>
-          <w:numId w:val="9"/>
-        </w:numPr>
-      </w:pPr>
-      <w:r>
-        <w:t xml:space="preserve">Implemented </w:t>
-      </w:r>
-      <w:proofErr w:type="gramStart"/>
-      <w:r>
-        <w:t>FCHSIZE(</w:t>
-      </w:r>
-      <w:proofErr w:type="gramEnd"/>
-      <w:r>
-        <w:t xml:space="preserve">) and VFP-compatible </w:t>
-      </w:r>
-      <w:proofErr w:type="gramStart"/>
-      <w:r>
-        <w:t>BINTOC(</w:t>
-      </w:r>
-      <w:proofErr w:type="gramEnd"/>
-      <w:r>
-        <w:t xml:space="preserve">) / </w:t>
-      </w:r>
-      <w:proofErr w:type="gramStart"/>
-      <w:r>
-        <w:t>CTOBIN(</w:t>
-      </w:r>
-      <w:proofErr w:type="gramEnd"/>
-      <w:r>
-        <w:t>) (#1893)</w:t>
-      </w:r>
-    </w:p>
-    <w:p>
-      <w:pPr>
-        <w:numPr>
-          <w:ilvl w:val="0"/>
-          <w:numId w:val="9"/>
-        </w:numPr>
-      </w:pPr>
-      <w:r>
-        <w:t xml:space="preserve">Fixed </w:t>
-      </w:r>
-      <w:proofErr w:type="gramStart"/>
-      <w:r>
-        <w:t>SYSMETRIC(</w:t>
-      </w:r>
-      <w:proofErr w:type="gramEnd"/>
-      <w:r>
-        <w:t>) calls, SET MEMOWIDTH typo, and SET DEFAULT/DIRECTORY initialization issues at startup (#1894)</w:t>
-      </w:r>
-    </w:p>
-    <w:p>
-      <w:pPr>
-        <w:numPr>
-          <w:ilvl w:val="0"/>
-          <w:numId w:val="9"/>
-        </w:numPr>
-      </w:pPr>
-      <w:r>
-        <w:t xml:space="preserve">Fixed </w:t>
-      </w:r>
-      <w:proofErr w:type="spellStart"/>
-      <w:r>
-        <w:t>MemoHelpers.MAX_WIDTH</w:t>
-      </w:r>
-      <w:proofErr w:type="spellEnd"/>
-      <w:r>
-        <w:t xml:space="preserve"> to be a dynamic property (#1895)</w:t>
-      </w:r>
-    </w:p>
-    <w:p>
-      <w:pPr>
-        <w:numPr>
-          <w:ilvl w:val="0"/>
-          <w:numId w:val="9"/>
-        </w:numPr>
-      </w:pPr>
-      <w:r>
-        <w:t xml:space="preserve">Implemented </w:t>
-      </w:r>
-      <w:proofErr w:type="gramStart"/>
-      <w:r>
-        <w:t>GETDIR(</w:t>
-      </w:r>
-      <w:proofErr w:type="gramEnd"/>
-      <w:r>
-        <w:t xml:space="preserve">), </w:t>
-      </w:r>
-      <w:proofErr w:type="gramStart"/>
-      <w:r>
-        <w:t>GETFILE(</w:t>
-      </w:r>
-      <w:proofErr w:type="gramEnd"/>
-      <w:r>
-        <w:t xml:space="preserve">) and </w:t>
-      </w:r>
-      <w:proofErr w:type="gramStart"/>
-      <w:r>
-        <w:t>GETPICT(</w:t>
-      </w:r>
-      <w:proofErr w:type="gramEnd"/>
-      <w:r>
-        <w:t>) dialog functions (#1896)</w:t>
-      </w:r>
-    </w:p>
-    <w:p>
-      <w:pPr>
-        <w:numPr>
-          <w:ilvl w:val="0"/>
-          <w:numId w:val="9"/>
-        </w:numPr>
-      </w:pPr>
-      <w:r>
-        <w:t xml:space="preserve">Fixed </w:t>
-      </w:r>
-      <w:proofErr w:type="gramStart"/>
-      <w:r>
-        <w:t>MESSAGEBOX(</w:t>
-      </w:r>
-      <w:proofErr w:type="gramEnd"/>
-      <w:r>
-        <w:t>) timeout issue and implemented dynamic parameter handling (#1897)</w:t>
-      </w:r>
-    </w:p>
-    <w:p>
-      <w:pPr>
-        <w:numPr>
-          <w:ilvl w:val="0"/>
-          <w:numId w:val="9"/>
-        </w:numPr>
-      </w:pPr>
-      <w:r>
-        <w:t>Implemented DIR/DIRECTORY command with output parity to VFP (#1900)</w:t>
-      </w:r>
-    </w:p>
-    <w:p>
-      <w:pPr>
-        <w:numPr>
-          <w:ilvl w:val="0"/>
-          <w:numId w:val="9"/>
-        </w:numPr>
-      </w:pPr>
-      <w:r>
-        <w:t>Implemented SET DEVICE TO FILE redirection (#1901)</w:t>
-      </w:r>
-    </w:p>
-    <w:p>
-      <w:pPr>
-        <w:numPr>
-          <w:ilvl w:val="0"/>
-          <w:numId w:val="9"/>
-        </w:numPr>
-      </w:pPr>
-      <w:r>
-        <w:t xml:space="preserve">Implemented </w:t>
-      </w:r>
-      <w:proofErr w:type="gramStart"/>
-      <w:r>
-        <w:t>ISPEN(</w:t>
-      </w:r>
-      <w:proofErr w:type="gramEnd"/>
-      <w:r>
-        <w:t xml:space="preserve">) (returns FALSE — no Tablet support) and </w:t>
-      </w:r>
-      <w:proofErr w:type="gramStart"/>
-      <w:r>
-        <w:t>IMESTATUS(</w:t>
-      </w:r>
-      <w:proofErr w:type="gramEnd"/>
-      <w:r>
-        <w:t>) (returns 0 — no IME support) (#1924)</w:t>
-      </w:r>
-    </w:p>
-    <w:p>
-      <w:pPr>
-        <w:numPr>
-          <w:ilvl w:val="0"/>
-          <w:numId w:val="9"/>
-        </w:numPr>
-      </w:pPr>
-      <w:r>
-        <w:t xml:space="preserve">Implemented </w:t>
-      </w:r>
-      <w:proofErr w:type="gramStart"/>
-      <w:r>
-        <w:t>PROW(</w:t>
-      </w:r>
-      <w:proofErr w:type="gramEnd"/>
-      <w:r>
-        <w:t xml:space="preserve">) and </w:t>
-      </w:r>
-      <w:proofErr w:type="gramStart"/>
-      <w:r>
         <w:t>PCOL(</w:t>
       </w:r>
       <w:proofErr w:type="gramEnd"/>
       <w:r>
         <w:t>) printer position functions (#1925)</w:t>
-      </w:r>
-    </w:p>
-    <w:p>
-      <w:pPr>
-        <w:numPr>
-          <w:ilvl w:val="0"/>
-          <w:numId w:val="9"/>
-        </w:numPr>
-      </w:pPr>
-      <w:r>
-        <w:t xml:space="preserve">Implemented </w:t>
-      </w:r>
-      <w:proofErr w:type="gramStart"/>
-      <w:r>
-        <w:t>TXNLEVEL(</w:t>
-      </w:r>
-      <w:proofErr w:type="gramEnd"/>
-      <w:r>
-        <w:t>) which returns the current transaction nesting level (#1927)</w:t>
       </w:r>
     </w:p>
     <w:p>
@@ -4237,6 +3006,25 @@
       </w:r>
       <w:proofErr w:type="gramStart"/>
       <w:r>
+        <w:t>TXNLEVEL(</w:t>
+      </w:r>
+      <w:proofErr w:type="gramEnd"/>
+      <w:r>
+        <w:t>) which returns the current transaction nesting level (#1927)</w:t>
+      </w:r>
+    </w:p>
+    <w:p>
+      <w:pPr>
+        <w:numPr>
+          <w:ilvl w:val="0"/>
+          <w:numId w:val="9"/>
+        </w:numPr>
+      </w:pPr>
+      <w:r>
+        <w:t xml:space="preserve">Implemented </w:t>
+      </w:r>
+      <w:proofErr w:type="gramStart"/>
+      <w:r>
         <w:t>ISMEMOFETCHED(</w:t>
       </w:r>
       <w:proofErr w:type="gramEnd"/>
@@ -4360,27 +3148,17 @@
       <w:r>
         <w:t xml:space="preserve">Fixed an issue with </w:t>
       </w:r>
-      <w:proofErr w:type="spellStart"/>
-      <w:proofErr w:type="gramStart"/>
-      <w:r>
-        <w:t>Strtran</w:t>
-      </w:r>
-      <w:proofErr w:type="spellEnd"/>
-      <w:r>
-        <w:t>(</w:t>
+      <w:proofErr w:type="gramStart"/>
+      <w:r>
+        <w:t>Strtran(</w:t>
       </w:r>
       <w:proofErr w:type="gramEnd"/>
       <w:r>
         <w:t xml:space="preserve">), </w:t>
       </w:r>
-      <w:proofErr w:type="spellStart"/>
-      <w:proofErr w:type="gramStart"/>
-      <w:r>
-        <w:t>ExecScript</w:t>
-      </w:r>
-      <w:proofErr w:type="spellEnd"/>
-      <w:r>
-        <w:t>(</w:t>
+      <w:proofErr w:type="gramStart"/>
+      <w:r>
+        <w:t>ExecScript(</w:t>
       </w:r>
       <w:proofErr w:type="gramEnd"/>
       <w:r>
@@ -4661,21 +3439,14 @@
         </w:numPr>
       </w:pPr>
       <w:r>
+        <w:lastRenderedPageBreak/>
         <w:t>Project</w:t>
       </w:r>
       <w:r>
         <w:t xml:space="preserve"> </w:t>
       </w:r>
       <w:r>
-        <w:t xml:space="preserve">References in SDK projects no longer store the name, </w:t>
-      </w:r>
-      <w:proofErr w:type="spellStart"/>
-      <w:r>
-        <w:t>guid</w:t>
-      </w:r>
-      <w:proofErr w:type="spellEnd"/>
-      <w:r>
-        <w:t xml:space="preserve"> etc.</w:t>
+        <w:t>References in SDK projects no longer store the name, guid etc.</w:t>
       </w:r>
     </w:p>
     <w:p>
@@ -4686,7 +3457,6 @@
         </w:numPr>
       </w:pPr>
       <w:r>
-        <w:lastRenderedPageBreak/>
         <w:t>The Build/Cancel button was not visible when a X# project was selected and another project was being built. (#1799)</w:t>
       </w:r>
     </w:p>
@@ -4708,12 +3478,10 @@
       <w:r>
         <w:t xml:space="preserve"> initializer for '</w:t>
       </w:r>
-      <w:proofErr w:type="spellStart"/>
       <w:proofErr w:type="gramStart"/>
       <w:r>
         <w:t>XSharp.Project.ErrorListManager</w:t>
       </w:r>
-      <w:proofErr w:type="spellEnd"/>
       <w:proofErr w:type="gramEnd"/>
       <w:r>
         <w:t>' threw an exception” when loading projects in VS2026 (#1800)</w:t>
@@ -4750,23 +3518,7 @@
         </w:numPr>
       </w:pPr>
       <w:r>
-        <w:t>The include-files node could sometimes show files, even after the /</w:t>
-      </w:r>
-      <w:proofErr w:type="spellStart"/>
-      <w:r>
-        <w:t>nostddef</w:t>
-      </w:r>
-      <w:proofErr w:type="spellEnd"/>
-      <w:r>
-        <w:t xml:space="preserve"> compiler option was selected on the project properties page. We recommend a touch of all the files in a project to completely refresh (clear) </w:t>
-      </w:r>
-      <w:proofErr w:type="spellStart"/>
-      <w:r>
-        <w:t>the</w:t>
-      </w:r>
-      <w:proofErr w:type="spellEnd"/>
-      <w:r>
-        <w:t xml:space="preserve"> include list. (#1805)</w:t>
+        <w:t>The include-files node could sometimes show files, even after the /nostddef compiler option was selected on the project properties page. We recommend a touch of all the files in a project to completely refresh (clear) the include list. (#1805)</w:t>
       </w:r>
     </w:p>
     <w:p>
@@ -4804,21 +3556,8 @@
       <w:r>
         <w:t xml:space="preserve"> </w:t>
       </w:r>
-      <w:proofErr w:type="spellStart"/>
-      <w:r>
-        <w:t>Guid</w:t>
-      </w:r>
-      <w:proofErr w:type="spellEnd"/>
-      <w:r>
-        <w:t xml:space="preserve"> properties to SDK projects. </w:t>
-      </w:r>
-      <w:proofErr w:type="spellStart"/>
-      <w:r>
-        <w:t>Guids</w:t>
-      </w:r>
-      <w:proofErr w:type="spellEnd"/>
-      <w:r>
-        <w:t xml:space="preserve"> are also removed from project references inside SDK </w:t>
+      <w:r>
+        <w:t xml:space="preserve">Guid properties to SDK projects. Guids are also removed from project references inside SDK </w:t>
       </w:r>
       <w:r>
         <w:t>projects. (</w:t>
@@ -5117,23 +3856,7 @@
         </w:numPr>
       </w:pPr>
       <w:r>
-        <w:t xml:space="preserve">Methods named FIELDGET and FIELDPUT (in uppercase) are now named </w:t>
-      </w:r>
-      <w:proofErr w:type="spellStart"/>
-      <w:r>
-        <w:t>FieldGet</w:t>
-      </w:r>
-      <w:proofErr w:type="spellEnd"/>
-      <w:r>
-        <w:t xml:space="preserve"> and </w:t>
-      </w:r>
-      <w:proofErr w:type="spellStart"/>
-      <w:r>
-        <w:t>FieldPut</w:t>
-      </w:r>
-      <w:proofErr w:type="spellEnd"/>
-      <w:r>
-        <w:t xml:space="preserve"> to be compatible with the case of other methods.</w:t>
+        <w:t>Methods named FIELDGET and FIELDPUT (in uppercase) are now named FieldGet and FieldPut to be compatible with the case of other methods.</w:t>
       </w:r>
     </w:p>
     <w:p>
@@ -5160,23 +3883,7 @@
         </w:numPr>
       </w:pPr>
       <w:r>
-        <w:t xml:space="preserve">The menu and toolbar class now internally use the </w:t>
-      </w:r>
-      <w:proofErr w:type="spellStart"/>
-      <w:r>
-        <w:t>MenuStrip</w:t>
-      </w:r>
-      <w:proofErr w:type="spellEnd"/>
-      <w:r>
-        <w:t xml:space="preserve"> and </w:t>
-      </w:r>
-      <w:proofErr w:type="spellStart"/>
-      <w:r>
-        <w:t>ToolStrip</w:t>
-      </w:r>
-      <w:proofErr w:type="spellEnd"/>
-      <w:r>
-        <w:t xml:space="preserve"> classes from Windows Forms because the classes that were used before are no longer supported in newer versions of .Net.</w:t>
+        <w:t>The menu and toolbar class now internally use the MenuStrip and ToolStrip classes from Windows Forms because the classes that were used before are no longer supported in newer versions of .Net.</w:t>
       </w:r>
     </w:p>
     <w:p>
@@ -6241,6 +4948,7 @@
   <w:style w:type="character" w:default="1" w:styleId="DefaultParagraphFont">
     <w:name w:val="Default Paragraph Font"/>
     <w:uiPriority w:val="1"/>
+    <w:semiHidden/>
     <w:unhideWhenUsed/>
   </w:style>
   <w:style w:type="table" w:default="1" w:styleId="TableNormal">

</xml_diff>

<commit_message>
[Doc] Update doc for fix in LanguageService
</commit_message>
<xml_diff>
--- a/docs/whatsnew.docx
+++ b/docs/whatsnew.docx
@@ -855,6 +855,20 @@
     </w:p>
     <w:p>
       <w:pPr>
+        <w:numPr>
+          <w:ilvl w:val="0"/>
+          <w:numId w:val="2"/>
+        </w:numPr>
+      </w:pPr>
+      <w:r>
+        <w:rPr>
+          <w:lang w:val="x-none"/>
+        </w:rPr>
+        <w:t>Fixed an issue with the type lookup for the loop variables of a FOREACH loop (#2129)</w:t>
+      </w:r>
+    </w:p>
+    <w:p>
+      <w:pPr>
         <w:pStyle w:val="Heading2"/>
       </w:pPr>
       <w:r>
@@ -979,6 +993,7 @@
         </w:numPr>
       </w:pPr>
       <w:r>
+        <w:lastRenderedPageBreak/>
         <w:t>Fixed SET SKIP conversion and improved continuing-line and comment handling during export</w:t>
       </w:r>
     </w:p>
@@ -990,7 +1005,6 @@
         </w:numPr>
       </w:pPr>
       <w:r>
-        <w:lastRenderedPageBreak/>
         <w:t>Fixed output-folder handling, destination-folder cleanup, file-deletion messages, and missing ColorProperties.json deployment</w:t>
       </w:r>
     </w:p>
@@ -1240,11 +1254,8 @@
         </w:numPr>
       </w:pPr>
       <w:r>
-        <w:t xml:space="preserve">Fixed overload resolution when a Clipper calling convention function is called with a single </w:t>
-      </w:r>
-      <w:r>
         <w:lastRenderedPageBreak/>
-        <w:t>NULL_OBJECT argument (#1782, #1016)</w:t>
+        <w:t>Fixed overload resolution when a Clipper calling convention function is called with a single NULL_OBJECT argument (#1782, #1016)</w:t>
       </w:r>
     </w:p>
     <w:p>
@@ -1529,12 +1540,14 @@
       </w:r>
       <w:r>
         <w:br/>
+      </w:r>
+      <w:r>
+        <w:lastRenderedPageBreak/>
         <w:t xml:space="preserve">We have used the new IN keyword for many that use parameters defined AS USUAL. </w:t>
       </w:r>
     </w:p>
     <w:p>
       <w:r>
-        <w:lastRenderedPageBreak/>
         <w:t xml:space="preserve">The new modifier tells the compiler to pass the variable by reference, which should make the code slightly faster. </w:t>
       </w:r>
     </w:p>
@@ -1888,11 +1901,11 @@
         </w:numPr>
       </w:pPr>
       <w:r>
-        <w:t xml:space="preserve">The XSharp.VFP assembly now contains function definitions for all functions from VFP, even the ones that exist in XSharp.Core and XSharp.RT. These functions will delegate the work to the </w:t>
+        <w:t xml:space="preserve">The XSharp.VFP assembly now contains function definitions for all functions from VFP, even the </w:t>
       </w:r>
       <w:r>
         <w:lastRenderedPageBreak/>
-        <w:t>implementation in the other assemblies.</w:t>
+        <w:t>ones that exist in XSharp.Core and XSharp.RT. These functions will delegate the work to the implementation in the other assemblies.</w:t>
       </w:r>
     </w:p>
     <w:p>
@@ -2259,7 +2272,11 @@
         </w:numPr>
       </w:pPr>
       <w:r>
-        <w:t>Implemented ISPEN() (returns FALSE — no Tablet support) and IMESTATUS() (returns 0 — no IME support) (#1924)</w:t>
+        <w:t xml:space="preserve">Implemented ISPEN() (returns FALSE — no Tablet support) and IMESTATUS() (returns 0 — no IME </w:t>
+      </w:r>
+      <w:r>
+        <w:lastRenderedPageBreak/>
+        <w:t>support) (#1924)</w:t>
       </w:r>
     </w:p>
     <w:p>
@@ -2270,7 +2287,6 @@
         </w:numPr>
       </w:pPr>
       <w:r>
-        <w:lastRenderedPageBreak/>
         <w:t>Implemented PROW() and PCOL() printer position functions (#1925)</w:t>
       </w:r>
     </w:p>
@@ -2593,7 +2609,11 @@
         </w:numPr>
       </w:pPr>
       <w:r>
-        <w:t>When a project has multiple project references to the same external project, then problems could occur. This has been fixed. The second reference gets (silently) ignored.</w:t>
+        <w:t xml:space="preserve">When a project has multiple project references to the same external project, then problems </w:t>
+      </w:r>
+      <w:r>
+        <w:lastRenderedPageBreak/>
+        <w:t>could occur. This has been fixed. The second reference gets (silently) ignored.</w:t>
       </w:r>
     </w:p>
     <w:p>
@@ -2604,309 +2624,386 @@
         </w:numPr>
       </w:pPr>
       <w:r>
+        <w:t xml:space="preserve">The document formatter now excludes lines that are part of a TEXT ... ENDTEXT </w:t>
+      </w:r>
+    </w:p>
+    <w:p>
+      <w:pPr>
+        <w:numPr>
+          <w:ilvl w:val="0"/>
+          <w:numId w:val="11"/>
+        </w:numPr>
+      </w:pPr>
+      <w:r>
+        <w:t>Project</w:t>
+      </w:r>
+      <w:r>
+        <w:t xml:space="preserve"> </w:t>
+      </w:r>
+      <w:r>
+        <w:t>References in SDK projects no longer store the name, guid etc.</w:t>
+      </w:r>
+    </w:p>
+    <w:p>
+      <w:pPr>
+        <w:numPr>
+          <w:ilvl w:val="0"/>
+          <w:numId w:val="11"/>
+        </w:numPr>
+      </w:pPr>
+      <w:r>
+        <w:t>The Build/Cancel button was not visible when a X# project was selected and another project was being built. (#1799)</w:t>
+      </w:r>
+    </w:p>
+    <w:p>
+      <w:pPr>
+        <w:numPr>
+          <w:ilvl w:val="0"/>
+          <w:numId w:val="11"/>
+        </w:numPr>
+      </w:pPr>
+      <w:r>
+        <w:t>Fixed an error “the type initializer for 'XSharp.Project.ErrorListManager' threw an exception” when loading projects in VS2026 (#1800)</w:t>
+      </w:r>
+    </w:p>
+    <w:p>
+      <w:pPr>
+        <w:numPr>
+          <w:ilvl w:val="0"/>
+          <w:numId w:val="11"/>
+        </w:numPr>
+      </w:pPr>
+      <w:r>
+        <w:t>Fixed issue where the project system was incorrectly responding to the Package</w:t>
+      </w:r>
+      <w:r>
+        <w:t xml:space="preserve"> </w:t>
+      </w:r>
+      <w:r>
+        <w:t xml:space="preserve">References project dependency. This caused the first Build in Visual Studio to </w:t>
+      </w:r>
+      <w:r>
+        <w:t>freeze. (</w:t>
+      </w:r>
+      <w:r>
+        <w:t>#1802)</w:t>
+      </w:r>
+    </w:p>
+    <w:p>
+      <w:pPr>
+        <w:numPr>
+          <w:ilvl w:val="0"/>
+          <w:numId w:val="11"/>
+        </w:numPr>
+      </w:pPr>
+      <w:r>
+        <w:t>The include-files node could sometimes show files, even after the /nostddef compiler option was selected on the project properties page. We recommend a touch of all the files in a project to completely refresh (clear) the include list. (#1805)</w:t>
+      </w:r>
+    </w:p>
+    <w:p>
+      <w:pPr>
+        <w:numPr>
+          <w:ilvl w:val="0"/>
+          <w:numId w:val="11"/>
+        </w:numPr>
+      </w:pPr>
+      <w:r>
+        <w:t>Sometimes VS would freeze when adding an assembly reference. This has been fixed (#1814)</w:t>
+      </w:r>
+    </w:p>
+    <w:p>
+      <w:pPr>
+        <w:numPr>
+          <w:ilvl w:val="0"/>
+          <w:numId w:val="11"/>
+        </w:numPr>
+      </w:pPr>
+      <w:r>
+        <w:t>Fixed an issue with duplicate reference names in the Solution Explorer window (#1816)</w:t>
+      </w:r>
+    </w:p>
+    <w:p>
+      <w:pPr>
+        <w:numPr>
+          <w:ilvl w:val="0"/>
+          <w:numId w:val="11"/>
+        </w:numPr>
+      </w:pPr>
+      <w:r>
+        <w:t>We no longer add Project</w:t>
+      </w:r>
+      <w:r>
+        <w:t xml:space="preserve"> </w:t>
+      </w:r>
+      <w:r>
+        <w:t xml:space="preserve">Guid properties to SDK projects. Guids are also removed from project references inside SDK </w:t>
+      </w:r>
+      <w:r>
+        <w:t>projects. (</w:t>
+      </w:r>
+      <w:r>
+        <w:t>#1819)</w:t>
+      </w:r>
+    </w:p>
+    <w:p>
+      <w:pPr>
+        <w:numPr>
+          <w:ilvl w:val="0"/>
+          <w:numId w:val="11"/>
+        </w:numPr>
+      </w:pPr>
+      <w:r>
+        <w:t xml:space="preserve">The IDE has been prepared for a menu option to convert a traditional project to the new SDK project file </w:t>
+      </w:r>
+      <w:r>
+        <w:t>format. (</w:t>
+      </w:r>
+      <w:r>
+        <w:t xml:space="preserve"> #1823). The menu option is not working yet.</w:t>
+      </w:r>
+    </w:p>
+    <w:p>
+      <w:pPr>
+        <w:numPr>
+          <w:ilvl w:val="0"/>
+          <w:numId w:val="11"/>
+        </w:numPr>
+      </w:pPr>
+      <w:r>
+        <w:t>Fixed a crash when Visual Studio was opened directly with a solution file (#1918)</w:t>
+      </w:r>
+    </w:p>
+    <w:p>
+      <w:pPr>
+        <w:numPr>
+          <w:ilvl w:val="0"/>
+          <w:numId w:val="11"/>
+        </w:numPr>
+      </w:pPr>
+      <w:r>
+        <w:t>Replaced bitmap-backed command icons and project hierarchy icons with Visual Studio Image</w:t>
+      </w:r>
+      <w:r>
+        <w:t xml:space="preserve"> </w:t>
+      </w:r>
+      <w:r>
+        <w:t>Monikers (#1921)</w:t>
+      </w:r>
+    </w:p>
+    <w:p>
+      <w:pPr>
+        <w:numPr>
+          <w:ilvl w:val="0"/>
+          <w:numId w:val="11"/>
+        </w:numPr>
+      </w:pPr>
+      <w:r>
+        <w:t>Fixed a deadlock when opening a solution from the command line (#1922)</w:t>
+      </w:r>
+    </w:p>
+    <w:p>
+      <w:pPr>
+        <w:numPr>
+          <w:ilvl w:val="0"/>
+          <w:numId w:val="11"/>
+        </w:numPr>
+      </w:pPr>
+      <w:r>
+        <w:t>Fixed incorrect conditional compilation block highlighting: the language service now uses the correct preprocessor defines from the active project configuration (#1923)</w:t>
+      </w:r>
+    </w:p>
+    <w:p>
+      <w:pPr>
+        <w:numPr>
+          <w:ilvl w:val="0"/>
+          <w:numId w:val="11"/>
+        </w:numPr>
+      </w:pPr>
+      <w:r>
+        <w:t>Fixed an issue with Project References for SDK projects where these references were not shown in the "Add Reference" dialog (#1928)</w:t>
+      </w:r>
+    </w:p>
+    <w:p>
+      <w:pPr>
+        <w:numPr>
+          <w:ilvl w:val="0"/>
+          <w:numId w:val="11"/>
+        </w:numPr>
+      </w:pPr>
+      <w:r>
+        <w:t>Fixed an issue with Project References for SDK projects where these references were not shown in the Project Dependencies page of the Solution Properties window ((#1929)</w:t>
+      </w:r>
+    </w:p>
+    <w:p>
+      <w:pPr>
+        <w:numPr>
+          <w:ilvl w:val="0"/>
+          <w:numId w:val="11"/>
+        </w:numPr>
+      </w:pPr>
+      <w:r>
+        <w:t>L</w:t>
+      </w:r>
+      <w:r>
+        <w:t xml:space="preserve">ocal functions </w:t>
+      </w:r>
+      <w:r>
+        <w:t xml:space="preserve">were </w:t>
+      </w:r>
+      <w:r>
+        <w:t xml:space="preserve">not </w:t>
+      </w:r>
+      <w:r>
+        <w:t xml:space="preserve">always </w:t>
+      </w:r>
+      <w:r>
+        <w:t>appearing correctly in the Navigation Bar and Document Outline window (#1932)</w:t>
+      </w:r>
+    </w:p>
+    <w:p>
+      <w:pPr>
+        <w:numPr>
+          <w:ilvl w:val="0"/>
+          <w:numId w:val="11"/>
+        </w:numPr>
+      </w:pPr>
+      <w:r>
+        <w:t>Fixed the navigation bar not displaying all entities in files with nested classes, and not following the cursor when it moves past the last declared entity (#1934)</w:t>
+      </w:r>
+    </w:p>
+    <w:p>
+      <w:pPr>
+        <w:numPr>
+          <w:ilvl w:val="0"/>
+          <w:numId w:val="11"/>
+        </w:numPr>
+      </w:pPr>
+      <w:r>
+        <w:t>Fixed an issue where Goto Definition would fail when a project folder contains another project and the option "Show All Files" was enabled, showing that other project as "Non</w:t>
+      </w:r>
+      <w:r>
+        <w:t>-</w:t>
+      </w:r>
+      <w:r>
+        <w:t>member Item".</w:t>
+      </w:r>
+    </w:p>
+    <w:p>
+      <w:pPr>
+        <w:numPr>
+          <w:ilvl w:val="0"/>
+          <w:numId w:val="11"/>
+        </w:numPr>
+      </w:pPr>
+      <w:r>
+        <w:t xml:space="preserve">Sometimes reading </w:t>
+      </w:r>
+      <w:r>
+        <w:t xml:space="preserve">of </w:t>
+      </w:r>
+      <w:r>
+        <w:t>type information from Assembly</w:t>
+      </w:r>
+      <w:r>
+        <w:t xml:space="preserve"> R</w:t>
+      </w:r>
+      <w:r>
+        <w:t xml:space="preserve">eferences </w:t>
+      </w:r>
+      <w:r>
+        <w:t>fails</w:t>
+      </w:r>
+      <w:r>
+        <w:t>. This has been fixed.  (#1956)</w:t>
+      </w:r>
+    </w:p>
+    <w:p>
+      <w:pPr>
+        <w:numPr>
+          <w:ilvl w:val="0"/>
+          <w:numId w:val="11"/>
+        </w:numPr>
+      </w:pPr>
+      <w:r>
+        <w:t>The intellisense database was not removing entries from assemblies that were no longer in use by any project.</w:t>
+      </w:r>
+    </w:p>
+    <w:p>
+      <w:pPr>
+        <w:pStyle w:val="Heading2"/>
+      </w:pPr>
+      <w:r>
+        <w:t>Debugger</w:t>
+      </w:r>
+    </w:p>
+    <w:p>
+      <w:pPr>
+        <w:pStyle w:val="Heading3"/>
+      </w:pPr>
+      <w:r>
+        <w:t>New Features</w:t>
+      </w:r>
+    </w:p>
+    <w:p>
+      <w:pPr>
+        <w:numPr>
+          <w:ilvl w:val="0"/>
+          <w:numId w:val="12"/>
+        </w:numPr>
+      </w:pPr>
+      <w:r>
+        <w:t xml:space="preserve">The </w:t>
+      </w:r>
+      <w:r>
+        <w:t>work area</w:t>
+      </w:r>
+      <w:r>
+        <w:t xml:space="preserve"> window now also shows index information and the table structure</w:t>
+      </w:r>
+    </w:p>
+    <w:p>
+      <w:pPr>
+        <w:pStyle w:val="Heading3"/>
+      </w:pPr>
+      <w:r>
+        <w:t>Bug Fixes</w:t>
+      </w:r>
+    </w:p>
+    <w:p>
+      <w:pPr>
+        <w:numPr>
+          <w:ilvl w:val="0"/>
+          <w:numId w:val="12"/>
+        </w:numPr>
+      </w:pPr>
+      <w:r>
+        <w:t>Fixed an issue where the debugger was not correctly displaying Symbol values inside Usuals (#1804)</w:t>
+      </w:r>
+    </w:p>
+    <w:p>
+      <w:pPr>
+        <w:numPr>
+          <w:ilvl w:val="0"/>
+          <w:numId w:val="12"/>
+        </w:numPr>
+      </w:pPr>
+      <w:r>
+        <w:t>Fixed an issue in the debugger where USUAL values were not shown properly formatted (#1809)</w:t>
+      </w:r>
+    </w:p>
+    <w:p>
+      <w:pPr>
+        <w:numPr>
+          <w:ilvl w:val="0"/>
+          <w:numId w:val="12"/>
+        </w:numPr>
+      </w:pPr>
+      <w:r>
+        <w:t xml:space="preserve">Fixed an issue in the debugger where breakpoint conditions and watch expressions were not </w:t>
+      </w:r>
+      <w:r>
         <w:lastRenderedPageBreak/>
-        <w:t xml:space="preserve">The document formatter now excludes lines that are part of a TEXT ... ENDTEXT </w:t>
-      </w:r>
-    </w:p>
-    <w:p>
-      <w:pPr>
-        <w:numPr>
-          <w:ilvl w:val="0"/>
-          <w:numId w:val="11"/>
-        </w:numPr>
-      </w:pPr>
-      <w:r>
-        <w:t>Project</w:t>
-      </w:r>
-      <w:r>
-        <w:t xml:space="preserve"> </w:t>
-      </w:r>
-      <w:r>
-        <w:t>References in SDK projects no longer store the name, guid etc.</w:t>
-      </w:r>
-    </w:p>
-    <w:p>
-      <w:pPr>
-        <w:numPr>
-          <w:ilvl w:val="0"/>
-          <w:numId w:val="11"/>
-        </w:numPr>
-      </w:pPr>
-      <w:r>
-        <w:t>The Build/Cancel button was not visible when a X# project was selected and another project was being built. (#1799)</w:t>
-      </w:r>
-    </w:p>
-    <w:p>
-      <w:pPr>
-        <w:numPr>
-          <w:ilvl w:val="0"/>
-          <w:numId w:val="11"/>
-        </w:numPr>
-      </w:pPr>
-      <w:r>
-        <w:t>Fixed an error “the type initializer for 'XSharp.Project.ErrorListManager' threw an exception” when loading projects in VS2026 (#1800)</w:t>
-      </w:r>
-    </w:p>
-    <w:p>
-      <w:pPr>
-        <w:numPr>
-          <w:ilvl w:val="0"/>
-          <w:numId w:val="11"/>
-        </w:numPr>
-      </w:pPr>
-      <w:r>
-        <w:t>Fixed issue where the project system was incorrectly responding to the Package</w:t>
-      </w:r>
-      <w:r>
-        <w:t xml:space="preserve"> </w:t>
-      </w:r>
-      <w:r>
-        <w:t xml:space="preserve">References project dependency. This caused the first Build in Visual Studio to </w:t>
-      </w:r>
-      <w:r>
-        <w:t>freeze. (</w:t>
-      </w:r>
-      <w:r>
-        <w:t>#1802)</w:t>
-      </w:r>
-    </w:p>
-    <w:p>
-      <w:pPr>
-        <w:numPr>
-          <w:ilvl w:val="0"/>
-          <w:numId w:val="11"/>
-        </w:numPr>
-      </w:pPr>
-      <w:r>
-        <w:t>The include-files node could sometimes show files, even after the /nostddef compiler option was selected on the project properties page. We recommend a touch of all the files in a project to completely refresh (clear) the include list. (#1805)</w:t>
-      </w:r>
-    </w:p>
-    <w:p>
-      <w:pPr>
-        <w:numPr>
-          <w:ilvl w:val="0"/>
-          <w:numId w:val="11"/>
-        </w:numPr>
-      </w:pPr>
-      <w:r>
-        <w:t>Sometimes VS would freeze when adding an assembly reference. This has been fixed (#1814)</w:t>
-      </w:r>
-    </w:p>
-    <w:p>
-      <w:pPr>
-        <w:numPr>
-          <w:ilvl w:val="0"/>
-          <w:numId w:val="11"/>
-        </w:numPr>
-      </w:pPr>
-      <w:r>
-        <w:t>Fixed an issue with duplicate reference names in the Solution Explorer window (#1816)</w:t>
-      </w:r>
-    </w:p>
-    <w:p>
-      <w:pPr>
-        <w:numPr>
-          <w:ilvl w:val="0"/>
-          <w:numId w:val="11"/>
-        </w:numPr>
-      </w:pPr>
-      <w:r>
-        <w:t>We no longer add Project</w:t>
-      </w:r>
-      <w:r>
-        <w:t xml:space="preserve"> </w:t>
-      </w:r>
-      <w:r>
-        <w:t xml:space="preserve">Guid properties to SDK projects. Guids are also removed from project references inside SDK </w:t>
-      </w:r>
-      <w:r>
-        <w:t>projects. (</w:t>
-      </w:r>
-      <w:r>
-        <w:t>#1819)</w:t>
-      </w:r>
-    </w:p>
-    <w:p>
-      <w:pPr>
-        <w:numPr>
-          <w:ilvl w:val="0"/>
-          <w:numId w:val="11"/>
-        </w:numPr>
-      </w:pPr>
-      <w:r>
-        <w:t xml:space="preserve">The IDE has been prepared for a menu option to convert a traditional project to the new SDK project file </w:t>
-      </w:r>
-      <w:r>
-        <w:t>format. (</w:t>
-      </w:r>
-      <w:r>
-        <w:t xml:space="preserve"> #1823). The menu option is not working yet.</w:t>
-      </w:r>
-    </w:p>
-    <w:p>
-      <w:pPr>
-        <w:numPr>
-          <w:ilvl w:val="0"/>
-          <w:numId w:val="11"/>
-        </w:numPr>
-      </w:pPr>
-      <w:r>
-        <w:t>Fixed a crash when Visual Studio was opened directly with a solution file (#1918)</w:t>
-      </w:r>
-    </w:p>
-    <w:p>
-      <w:pPr>
-        <w:numPr>
-          <w:ilvl w:val="0"/>
-          <w:numId w:val="11"/>
-        </w:numPr>
-      </w:pPr>
-      <w:r>
-        <w:t>Replaced bitmap-backed command icons and project hierarchy icons with Visual Studio Image</w:t>
-      </w:r>
-      <w:r>
-        <w:t xml:space="preserve"> </w:t>
-      </w:r>
-      <w:r>
-        <w:t>Monikers (#1921)</w:t>
-      </w:r>
-    </w:p>
-    <w:p>
-      <w:pPr>
-        <w:numPr>
-          <w:ilvl w:val="0"/>
-          <w:numId w:val="11"/>
-        </w:numPr>
-      </w:pPr>
-      <w:r>
-        <w:t>Fixed a deadlock when opening a solution from the command line (#1922)</w:t>
-      </w:r>
-    </w:p>
-    <w:p>
-      <w:pPr>
-        <w:numPr>
-          <w:ilvl w:val="0"/>
-          <w:numId w:val="11"/>
-        </w:numPr>
-      </w:pPr>
-      <w:r>
-        <w:t>Fixed incorrect conditional compilation block highlighting: the language service now uses the correct preprocessor defines from the active project configuration (#1923)</w:t>
-      </w:r>
-    </w:p>
-    <w:p>
-      <w:pPr>
-        <w:numPr>
-          <w:ilvl w:val="0"/>
-          <w:numId w:val="11"/>
-        </w:numPr>
-      </w:pPr>
-      <w:r>
-        <w:t>Fixed an issue with Project References for SDK projects where these references were not shown in the "Add Reference" dialog (#1928)</w:t>
-      </w:r>
-    </w:p>
-    <w:p>
-      <w:pPr>
-        <w:numPr>
-          <w:ilvl w:val="0"/>
-          <w:numId w:val="11"/>
-        </w:numPr>
-      </w:pPr>
-      <w:r>
-        <w:t>Fixed an issue with Project References for SDK projects where these references were not shown in the Project Dependencies page of the Solution Properties window ((#1929)</w:t>
-      </w:r>
-    </w:p>
-    <w:p>
-      <w:pPr>
-        <w:numPr>
-          <w:ilvl w:val="0"/>
-          <w:numId w:val="11"/>
-        </w:numPr>
-      </w:pPr>
-      <w:r>
-        <w:t>L</w:t>
-      </w:r>
-      <w:r>
-        <w:t xml:space="preserve">ocal functions </w:t>
-      </w:r>
-      <w:r>
-        <w:t xml:space="preserve">were </w:t>
-      </w:r>
-      <w:r>
-        <w:t xml:space="preserve">not </w:t>
-      </w:r>
-      <w:r>
-        <w:t xml:space="preserve">always </w:t>
-      </w:r>
-      <w:r>
-        <w:t>appearing correctly in the Navigation Bar and Document Outline window (#1932)</w:t>
-      </w:r>
-    </w:p>
-    <w:p>
-      <w:pPr>
-        <w:numPr>
-          <w:ilvl w:val="0"/>
-          <w:numId w:val="11"/>
-        </w:numPr>
-      </w:pPr>
-      <w:r>
-        <w:t>Fixed the navigation bar not displaying all entities in files with nested classes, and not following the cursor when it moves past the last declared entity (#1934)</w:t>
-      </w:r>
-    </w:p>
-    <w:p>
-      <w:pPr>
-        <w:numPr>
-          <w:ilvl w:val="0"/>
-          <w:numId w:val="11"/>
-        </w:numPr>
-      </w:pPr>
-      <w:r>
-        <w:t>Fixed an issue where Goto Definition would fail when a project folder contains another project and the option "Show All Files" was enabled, showing that other project as "Non</w:t>
-      </w:r>
-      <w:r>
-        <w:t>-</w:t>
-      </w:r>
-      <w:r>
-        <w:t>member Item".</w:t>
-      </w:r>
-    </w:p>
-    <w:p>
-      <w:pPr>
-        <w:numPr>
-          <w:ilvl w:val="0"/>
-          <w:numId w:val="11"/>
-        </w:numPr>
-      </w:pPr>
-      <w:r>
-        <w:t xml:space="preserve">Sometimes reading </w:t>
-      </w:r>
-      <w:r>
-        <w:t xml:space="preserve">of </w:t>
-      </w:r>
-      <w:r>
-        <w:t>type information from Assembly</w:t>
-      </w:r>
-      <w:r>
-        <w:t xml:space="preserve"> R</w:t>
-      </w:r>
-      <w:r>
-        <w:t xml:space="preserve">eferences </w:t>
-      </w:r>
-      <w:r>
-        <w:t>fails</w:t>
-      </w:r>
-      <w:r>
-        <w:t>. This has been fixed.  (#1956)</w:t>
-      </w:r>
-    </w:p>
-    <w:p>
-      <w:pPr>
-        <w:numPr>
-          <w:ilvl w:val="0"/>
-          <w:numId w:val="11"/>
-        </w:numPr>
-      </w:pPr>
-      <w:r>
-        <w:t>The intellisense database was not removing entries from assemblies that were no longer in use by any project.</w:t>
+        <w:t>working (#1810)</w:t>
       </w:r>
     </w:p>
     <w:p>
@@ -2914,81 +3011,6 @@
         <w:pStyle w:val="Heading2"/>
       </w:pPr>
       <w:r>
-        <w:t>Debugger</w:t>
-      </w:r>
-    </w:p>
-    <w:p>
-      <w:pPr>
-        <w:pStyle w:val="Heading3"/>
-      </w:pPr>
-      <w:r>
-        <w:t>New Features</w:t>
-      </w:r>
-    </w:p>
-    <w:p>
-      <w:pPr>
-        <w:numPr>
-          <w:ilvl w:val="0"/>
-          <w:numId w:val="12"/>
-        </w:numPr>
-      </w:pPr>
-      <w:r>
-        <w:t xml:space="preserve">The </w:t>
-      </w:r>
-      <w:r>
-        <w:t>work area</w:t>
-      </w:r>
-      <w:r>
-        <w:t xml:space="preserve"> window now also shows index information and the table structure</w:t>
-      </w:r>
-    </w:p>
-    <w:p>
-      <w:pPr>
-        <w:pStyle w:val="Heading3"/>
-      </w:pPr>
-      <w:r>
-        <w:t>Bug Fixes</w:t>
-      </w:r>
-    </w:p>
-    <w:p>
-      <w:pPr>
-        <w:numPr>
-          <w:ilvl w:val="0"/>
-          <w:numId w:val="12"/>
-        </w:numPr>
-      </w:pPr>
-      <w:r>
-        <w:t>Fixed an issue where the debugger was not correctly displaying Symbol values inside Usuals (#1804)</w:t>
-      </w:r>
-    </w:p>
-    <w:p>
-      <w:pPr>
-        <w:numPr>
-          <w:ilvl w:val="0"/>
-          <w:numId w:val="12"/>
-        </w:numPr>
-      </w:pPr>
-      <w:r>
-        <w:t>Fixed an issue in the debugger where USUAL values were not shown properly formatted (#1809)</w:t>
-      </w:r>
-    </w:p>
-    <w:p>
-      <w:pPr>
-        <w:numPr>
-          <w:ilvl w:val="0"/>
-          <w:numId w:val="12"/>
-        </w:numPr>
-      </w:pPr>
-      <w:r>
-        <w:t>Fixed an issue in the debugger where breakpoint conditions and watch expressions were not working (#1810)</w:t>
-      </w:r>
-    </w:p>
-    <w:p>
-      <w:pPr>
-        <w:pStyle w:val="Heading2"/>
-      </w:pPr>
-      <w:r>
-        <w:lastRenderedPageBreak/>
         <w:t>VOSDK</w:t>
       </w:r>
     </w:p>

</xml_diff>